<commit_message>
nmv 27 07 2026
</commit_message>
<xml_diff>
--- a/TS Jatai Ghanam Project/TS 2.2/TS 2.2 Jatai Malayalam Corrections.docx
+++ b/TS Jatai Ghanam Project/TS 2.2/TS 2.2 Jatai Malayalam Corrections.docx
@@ -609,27 +609,7 @@
                 <w:sz w:val="32"/>
                 <w:szCs w:val="40"/>
               </w:rPr>
-              <w:t>)</w:t>
-            </w:r>
-            <w:proofErr w:type="gramStart"/>
-            <w:r>
-              <w:rPr>
-                <w:rFonts w:ascii="BRH Malayalam Extra" w:hAnsi="BRH Malayalam Extra" w:cs="BRH Malayalam Extra"/>
-                <w:color w:val="000000"/>
-                <w:sz w:val="32"/>
-                <w:szCs w:val="40"/>
-              </w:rPr>
-              <w:t>-  ¥</w:t>
-            </w:r>
-            <w:proofErr w:type="gramEnd"/>
-            <w:r>
-              <w:rPr>
-                <w:rFonts w:ascii="BRH Malayalam Extra" w:hAnsi="BRH Malayalam Extra" w:cs="BRH Malayalam Extra"/>
-                <w:color w:val="000000"/>
-                <w:sz w:val="32"/>
-                <w:szCs w:val="40"/>
-              </w:rPr>
-              <w:t>öe</w:t>
+              <w:t>)-  ¥öe</w:t>
             </w:r>
             <w:r>
               <w:rPr>
@@ -1002,19 +982,8 @@
                 <w:sz w:val="32"/>
                 <w:szCs w:val="40"/>
               </w:rPr>
-              <w:t>)</w:t>
-            </w:r>
-            <w:proofErr w:type="gramStart"/>
-            <w:r>
-              <w:rPr>
-                <w:rFonts w:ascii="BRH Malayalam Extra" w:hAnsi="BRH Malayalam Extra" w:cs="BRH Malayalam Extra"/>
-                <w:color w:val="000000"/>
-                <w:sz w:val="32"/>
-                <w:szCs w:val="40"/>
-              </w:rPr>
-              <w:t>-  sI</w:t>
-            </w:r>
-            <w:proofErr w:type="gramEnd"/>
+              <w:t>)-  sI</w:t>
+            </w:r>
             <w:r>
               <w:rPr>
                 <w:rFonts w:ascii="BRH Malayalam Extra" w:hAnsi="BRH Malayalam Extra" w:cs="BRH Malayalam Extra"/>
@@ -1307,27 +1276,7 @@
                 <w:sz w:val="32"/>
                 <w:szCs w:val="40"/>
               </w:rPr>
-              <w:t>)</w:t>
-            </w:r>
-            <w:proofErr w:type="gramStart"/>
-            <w:r>
-              <w:rPr>
-                <w:rFonts w:ascii="BRH Malayalam Extra" w:hAnsi="BRH Malayalam Extra" w:cs="BRH Malayalam Extra"/>
-                <w:color w:val="000000"/>
-                <w:sz w:val="32"/>
-                <w:szCs w:val="40"/>
-              </w:rPr>
-              <w:t>-  ¥</w:t>
-            </w:r>
-            <w:proofErr w:type="gramEnd"/>
-            <w:r>
-              <w:rPr>
-                <w:rFonts w:ascii="BRH Malayalam Extra" w:hAnsi="BRH Malayalam Extra" w:cs="BRH Malayalam Extra"/>
-                <w:color w:val="000000"/>
-                <w:sz w:val="32"/>
-                <w:szCs w:val="40"/>
-              </w:rPr>
-              <w:t>öe</w:t>
+              <w:t>)-  ¥öe</w:t>
             </w:r>
             <w:r>
               <w:rPr>
@@ -1717,19 +1666,8 @@
                 <w:sz w:val="32"/>
                 <w:szCs w:val="40"/>
               </w:rPr>
-              <w:t>)</w:t>
-            </w:r>
-            <w:proofErr w:type="gramStart"/>
-            <w:r>
-              <w:rPr>
-                <w:rFonts w:ascii="BRH Malayalam Extra" w:hAnsi="BRH Malayalam Extra" w:cs="BRH Malayalam Extra"/>
-                <w:color w:val="000000"/>
-                <w:sz w:val="32"/>
-                <w:szCs w:val="40"/>
-              </w:rPr>
-              <w:t>-  sI</w:t>
-            </w:r>
-            <w:proofErr w:type="gramEnd"/>
+              <w:t>)-  sI</w:t>
+            </w:r>
             <w:r>
               <w:rPr>
                 <w:rFonts w:ascii="BRH Malayalam Extra" w:hAnsi="BRH Malayalam Extra" w:cs="BRH Malayalam Extra"/>
@@ -2110,27 +2048,7 @@
                 <w:sz w:val="32"/>
                 <w:szCs w:val="40"/>
               </w:rPr>
-              <w:t>)</w:t>
-            </w:r>
-            <w:proofErr w:type="gramStart"/>
-            <w:r>
-              <w:rPr>
-                <w:rFonts w:ascii="BRH Malayalam Extra" w:hAnsi="BRH Malayalam Extra" w:cs="BRH Malayalam Extra"/>
-                <w:color w:val="000000"/>
-                <w:sz w:val="32"/>
-                <w:szCs w:val="40"/>
-              </w:rPr>
-              <w:t>-  k</w:t>
-            </w:r>
-            <w:proofErr w:type="gramEnd"/>
-            <w:r>
-              <w:rPr>
-                <w:rFonts w:ascii="BRH Malayalam Extra" w:hAnsi="BRH Malayalam Extra" w:cs="BRH Malayalam Extra"/>
-                <w:color w:val="000000"/>
-                <w:sz w:val="32"/>
-                <w:szCs w:val="40"/>
-              </w:rPr>
-              <w:t>±—sxI | Ad—dûpPx</w:t>
+              <w:t>)-  k±—sxI | Ad—dûpPx</w:t>
             </w:r>
             <w:r>
               <w:rPr>
@@ -2490,27 +2408,7 @@
                 <w:sz w:val="32"/>
                 <w:szCs w:val="40"/>
               </w:rPr>
-              <w:t>)</w:t>
-            </w:r>
-            <w:proofErr w:type="gramStart"/>
-            <w:r>
-              <w:rPr>
-                <w:rFonts w:ascii="BRH Malayalam Extra" w:hAnsi="BRH Malayalam Extra" w:cs="BRH Malayalam Extra"/>
-                <w:color w:val="000000"/>
-                <w:sz w:val="32"/>
-                <w:szCs w:val="40"/>
-              </w:rPr>
-              <w:t>-  Ad</w:t>
-            </w:r>
-            <w:proofErr w:type="gramEnd"/>
-            <w:r>
-              <w:rPr>
-                <w:rFonts w:ascii="BRH Malayalam Extra" w:hAnsi="BRH Malayalam Extra" w:cs="BRH Malayalam Extra"/>
-                <w:color w:val="000000"/>
-                <w:sz w:val="32"/>
-                <w:szCs w:val="40"/>
-              </w:rPr>
-              <w:t>—dûpPx</w:t>
+              <w:t>)-  Ad—dûpPx</w:t>
             </w:r>
             <w:r>
               <w:rPr>
@@ -2926,27 +2824,7 @@
                 <w:sz w:val="32"/>
                 <w:szCs w:val="40"/>
               </w:rPr>
-              <w:t>)</w:t>
-            </w:r>
-            <w:proofErr w:type="gramStart"/>
-            <w:r>
-              <w:rPr>
-                <w:rFonts w:ascii="BRH Malayalam Extra" w:hAnsi="BRH Malayalam Extra" w:cs="BRH Malayalam Extra"/>
-                <w:color w:val="000000"/>
-                <w:sz w:val="32"/>
-                <w:szCs w:val="40"/>
-              </w:rPr>
-              <w:t>-  Ad</w:t>
-            </w:r>
-            <w:proofErr w:type="gramEnd"/>
-            <w:r>
-              <w:rPr>
-                <w:rFonts w:ascii="BRH Malayalam Extra" w:hAnsi="BRH Malayalam Extra" w:cs="BRH Malayalam Extra"/>
-                <w:color w:val="000000"/>
-                <w:sz w:val="32"/>
-                <w:szCs w:val="40"/>
-              </w:rPr>
-              <w:t>—dûpPx</w:t>
+              <w:t>)-  Ad—dûpPx</w:t>
             </w:r>
             <w:r>
               <w:rPr>
@@ -3253,27 +3131,7 @@
                 <w:sz w:val="32"/>
                 <w:szCs w:val="40"/>
               </w:rPr>
-              <w:t>)</w:t>
-            </w:r>
-            <w:proofErr w:type="gramStart"/>
-            <w:r>
-              <w:rPr>
-                <w:rFonts w:ascii="BRH Malayalam Extra" w:hAnsi="BRH Malayalam Extra" w:cs="BRH Malayalam Extra"/>
-                <w:color w:val="000000"/>
-                <w:sz w:val="32"/>
-                <w:szCs w:val="40"/>
-              </w:rPr>
-              <w:t>-  k</w:t>
-            </w:r>
-            <w:proofErr w:type="gramEnd"/>
-            <w:r>
-              <w:rPr>
-                <w:rFonts w:ascii="BRH Malayalam Extra" w:hAnsi="BRH Malayalam Extra" w:cs="BRH Malayalam Extra"/>
-                <w:color w:val="000000"/>
-                <w:sz w:val="32"/>
-                <w:szCs w:val="40"/>
-              </w:rPr>
-              <w:t>±—sxI | Ad—dûpPx</w:t>
+              <w:t>)-  k±—sxI | Ad—dûpPx</w:t>
             </w:r>
             <w:r>
               <w:rPr>
@@ -3604,27 +3462,7 @@
                 <w:sz w:val="32"/>
                 <w:szCs w:val="40"/>
               </w:rPr>
-              <w:t>)</w:t>
-            </w:r>
-            <w:proofErr w:type="gramStart"/>
-            <w:r>
-              <w:rPr>
-                <w:rFonts w:ascii="BRH Malayalam Extra" w:hAnsi="BRH Malayalam Extra" w:cs="BRH Malayalam Extra"/>
-                <w:color w:val="000000"/>
-                <w:sz w:val="32"/>
-                <w:szCs w:val="40"/>
-              </w:rPr>
-              <w:t>-  Ad</w:t>
-            </w:r>
-            <w:proofErr w:type="gramEnd"/>
-            <w:r>
-              <w:rPr>
-                <w:rFonts w:ascii="BRH Malayalam Extra" w:hAnsi="BRH Malayalam Extra" w:cs="BRH Malayalam Extra"/>
-                <w:color w:val="000000"/>
-                <w:sz w:val="32"/>
-                <w:szCs w:val="40"/>
-              </w:rPr>
-              <w:t>—dûpPx</w:t>
+              <w:t>)-  Ad—dûpPx</w:t>
             </w:r>
             <w:r>
               <w:rPr>
@@ -4011,27 +3849,7 @@
                 <w:sz w:val="32"/>
                 <w:szCs w:val="40"/>
               </w:rPr>
-              <w:t>)</w:t>
-            </w:r>
-            <w:proofErr w:type="gramStart"/>
-            <w:r>
-              <w:rPr>
-                <w:rFonts w:ascii="BRH Malayalam Extra" w:hAnsi="BRH Malayalam Extra" w:cs="BRH Malayalam Extra"/>
-                <w:color w:val="000000"/>
-                <w:sz w:val="32"/>
-                <w:szCs w:val="40"/>
-              </w:rPr>
-              <w:t>-  Ad</w:t>
-            </w:r>
-            <w:proofErr w:type="gramEnd"/>
-            <w:r>
-              <w:rPr>
-                <w:rFonts w:ascii="BRH Malayalam Extra" w:hAnsi="BRH Malayalam Extra" w:cs="BRH Malayalam Extra"/>
-                <w:color w:val="000000"/>
-                <w:sz w:val="32"/>
-                <w:szCs w:val="40"/>
-              </w:rPr>
-              <w:t>—dûpPx</w:t>
+              <w:t>)-  Ad—dûpPx</w:t>
             </w:r>
             <w:r>
               <w:rPr>
@@ -4333,27 +4151,7 @@
                 <w:sz w:val="32"/>
                 <w:szCs w:val="40"/>
               </w:rPr>
-              <w:t>)</w:t>
-            </w:r>
-            <w:proofErr w:type="gramStart"/>
-            <w:r>
-              <w:rPr>
-                <w:rFonts w:ascii="BRH Malayalam Extra" w:hAnsi="BRH Malayalam Extra" w:cs="BRH Malayalam Extra"/>
-                <w:color w:val="000000"/>
-                <w:sz w:val="32"/>
-                <w:szCs w:val="40"/>
-              </w:rPr>
-              <w:t>-  B</w:t>
-            </w:r>
-            <w:proofErr w:type="gramEnd"/>
-            <w:r>
-              <w:rPr>
-                <w:rFonts w:ascii="BRH Malayalam Extra" w:hAnsi="BRH Malayalam Extra" w:cs="BRH Malayalam Extra"/>
-                <w:color w:val="000000"/>
-                <w:sz w:val="32"/>
-                <w:szCs w:val="40"/>
-              </w:rPr>
-              <w:t xml:space="preserve"> | E</w:t>
+              <w:t>)-  B | E</w:t>
             </w:r>
             <w:r>
               <w:rPr>
@@ -4599,27 +4397,7 @@
                 <w:sz w:val="32"/>
                 <w:szCs w:val="40"/>
               </w:rPr>
-              <w:t>)</w:t>
-            </w:r>
-            <w:proofErr w:type="gramStart"/>
-            <w:r>
-              <w:rPr>
-                <w:rFonts w:ascii="BRH Malayalam Extra" w:hAnsi="BRH Malayalam Extra" w:cs="BRH Malayalam Extra"/>
-                <w:color w:val="000000"/>
-                <w:sz w:val="32"/>
-                <w:szCs w:val="40"/>
-              </w:rPr>
-              <w:t>-  B</w:t>
-            </w:r>
-            <w:proofErr w:type="gramEnd"/>
-            <w:r>
-              <w:rPr>
-                <w:rFonts w:ascii="BRH Malayalam Extra" w:hAnsi="BRH Malayalam Extra" w:cs="BRH Malayalam Extra"/>
-                <w:color w:val="000000"/>
-                <w:sz w:val="32"/>
-                <w:szCs w:val="40"/>
-              </w:rPr>
-              <w:t xml:space="preserve"> | E</w:t>
+              <w:t>)-  B | E</w:t>
             </w:r>
             <w:r>
               <w:rPr>
@@ -6962,7 +6740,7 @@
       </w:tr>
       <w:tr>
         <w:trPr>
-          <w:trHeight w:val="1338"/>
+          <w:trHeight w:val="699"/>
         </w:trPr>
         <w:tc>
           <w:tcPr>
@@ -6980,7 +6758,6 @@
                 <w:color w:val="000000"/>
                 <w:sz w:val="32"/>
                 <w:szCs w:val="40"/>
-                <w:lang w:val="it-IT"/>
               </w:rPr>
             </w:pPr>
             <w:r>
@@ -6988,7 +6765,6 @@
                 <w:rFonts w:cs="BRH Malayalam Extra"/>
                 <w:color w:val="000000"/>
                 <w:szCs w:val="40"/>
-                <w:lang w:val="it-IT"/>
               </w:rPr>
               <w:t>60</w:t>
             </w:r>
@@ -6998,7 +6774,6 @@
                 <w:color w:val="000000"/>
                 <w:sz w:val="32"/>
                 <w:szCs w:val="40"/>
-                <w:lang w:val="it-IT"/>
               </w:rPr>
               <w:t>)</w:t>
             </w:r>
@@ -7008,7 +6783,6 @@
                 <w:color w:val="000000"/>
                 <w:sz w:val="32"/>
                 <w:szCs w:val="40"/>
-                <w:lang w:val="it-IT"/>
               </w:rPr>
               <w:tab/>
             </w:r>
@@ -7017,7 +6791,6 @@
                 <w:rFonts w:cs="BRH Malayalam Extra"/>
                 <w:color w:val="000000"/>
                 <w:szCs w:val="40"/>
-                <w:lang w:val="it-IT"/>
               </w:rPr>
               <w:t>2</w:t>
             </w:r>
@@ -7027,7 +6800,6 @@
                 <w:color w:val="000000"/>
                 <w:sz w:val="32"/>
                 <w:szCs w:val="40"/>
-                <w:lang w:val="it-IT"/>
               </w:rPr>
               <w:t>.</w:t>
             </w:r>
@@ -7036,7 +6808,6 @@
                 <w:rFonts w:cs="BRH Malayalam Extra"/>
                 <w:color w:val="000000"/>
                 <w:szCs w:val="40"/>
-                <w:lang w:val="it-IT"/>
               </w:rPr>
               <w:t>2</w:t>
             </w:r>
@@ -7046,7 +6817,6 @@
                 <w:color w:val="000000"/>
                 <w:sz w:val="32"/>
                 <w:szCs w:val="40"/>
-                <w:lang w:val="it-IT"/>
               </w:rPr>
               <w:t>.</w:t>
             </w:r>
@@ -7055,7 +6825,6 @@
                 <w:rFonts w:cs="BRH Malayalam Extra"/>
                 <w:color w:val="000000"/>
                 <w:szCs w:val="40"/>
-                <w:lang w:val="it-IT"/>
               </w:rPr>
               <w:t>4</w:t>
             </w:r>
@@ -7065,7 +6834,6 @@
                 <w:color w:val="000000"/>
                 <w:sz w:val="32"/>
                 <w:szCs w:val="40"/>
-                <w:lang w:val="it-IT"/>
               </w:rPr>
               <w:t>.</w:t>
             </w:r>
@@ -7074,7 +6842,6 @@
                 <w:rFonts w:cs="BRH Malayalam Extra"/>
                 <w:color w:val="000000"/>
                 <w:szCs w:val="40"/>
-                <w:lang w:val="it-IT"/>
               </w:rPr>
               <w:t>6</w:t>
             </w:r>
@@ -7084,7 +6851,6 @@
                 <w:color w:val="000000"/>
                 <w:sz w:val="32"/>
                 <w:szCs w:val="40"/>
-                <w:lang w:val="it-IT"/>
               </w:rPr>
               <w:t>(</w:t>
             </w:r>
@@ -7093,7 +6859,6 @@
                 <w:rFonts w:cs="BRH Malayalam Extra"/>
                 <w:color w:val="000000"/>
                 <w:szCs w:val="40"/>
-                <w:lang w:val="it-IT"/>
               </w:rPr>
               <w:t>48</w:t>
             </w:r>
@@ -7103,7 +6868,6 @@
                 <w:color w:val="000000"/>
                 <w:sz w:val="32"/>
                 <w:szCs w:val="40"/>
-                <w:lang w:val="it-IT"/>
               </w:rPr>
               <w:t>)-  Z¦ | sI</w:t>
             </w:r>
@@ -7113,17 +6877,15 @@
                 <w:color w:val="000000"/>
                 <w:sz w:val="26"/>
                 <w:szCs w:val="40"/>
-                <w:lang w:val="it-IT"/>
-              </w:rPr>
-              <w:t>–</w:t>
-            </w:r>
-            <w:r>
-              <w:rPr>
-                <w:rFonts w:ascii="BRH Malayalam Extra" w:hAnsi="BRH Malayalam Extra" w:cs="BRH Malayalam Extra"/>
-                <w:color w:val="000000"/>
-                <w:sz w:val="32"/>
-                <w:szCs w:val="40"/>
-                <w:lang w:val="it-IT"/>
+              </w:rPr>
+              <w:t>–</w:t>
+            </w:r>
+            <w:r>
+              <w:rPr>
+                <w:rFonts w:ascii="BRH Malayalam Extra" w:hAnsi="BRH Malayalam Extra" w:cs="BRH Malayalam Extra"/>
+                <w:color w:val="000000"/>
+                <w:sz w:val="32"/>
+                <w:szCs w:val="40"/>
               </w:rPr>
               <w:t xml:space="preserve">hp—Ç¦ | </w:t>
             </w:r>
@@ -7140,7 +6902,6 @@
                 <w:color w:val="000000"/>
                 <w:sz w:val="32"/>
                 <w:szCs w:val="40"/>
-                <w:lang w:val="it-IT"/>
               </w:rPr>
             </w:pPr>
             <w:r>
@@ -7149,7 +6910,6 @@
                 <w:color w:val="000000"/>
                 <w:sz w:val="32"/>
                 <w:szCs w:val="40"/>
-                <w:lang w:val="it-IT"/>
               </w:rPr>
               <w:t xml:space="preserve">Z¦ </w:t>
             </w:r>
@@ -7160,7 +6920,6 @@
                 <w:sz w:val="32"/>
                 <w:szCs w:val="40"/>
                 <w:highlight w:val="yellow"/>
-                <w:lang w:val="it-IT"/>
               </w:rPr>
               <w:t>s</w:t>
             </w:r>
@@ -7170,7 +6929,6 @@
                 <w:color w:val="000000"/>
                 <w:sz w:val="32"/>
                 <w:szCs w:val="40"/>
-                <w:lang w:val="it-IT"/>
               </w:rPr>
               <w:t>Ihp—</w:t>
             </w:r>
@@ -7181,7 +6939,6 @@
                 <w:sz w:val="32"/>
                 <w:szCs w:val="40"/>
                 <w:highlight w:val="yellow"/>
-                <w:lang w:val="it-IT"/>
               </w:rPr>
               <w:t>Ç¦</w:t>
             </w:r>
@@ -7192,7 +6949,6 @@
                 <w:sz w:val="26"/>
                 <w:szCs w:val="40"/>
                 <w:highlight w:val="yellow"/>
-                <w:lang w:val="it-IT"/>
               </w:rPr>
               <w:t>–</w:t>
             </w:r>
@@ -7203,7 +6959,6 @@
                 <w:sz w:val="32"/>
                 <w:szCs w:val="40"/>
                 <w:highlight w:val="yellow"/>
-                <w:lang w:val="it-IT"/>
               </w:rPr>
               <w:t xml:space="preserve"> sI</w:t>
             </w:r>
@@ -7213,7 +6968,6 @@
                 <w:color w:val="000000"/>
                 <w:sz w:val="32"/>
                 <w:szCs w:val="40"/>
-                <w:lang w:val="it-IT"/>
               </w:rPr>
               <w:t>hp—Ç¦</w:t>
             </w:r>
@@ -7223,17 +6977,15 @@
                 <w:color w:val="000000"/>
                 <w:sz w:val="26"/>
                 <w:szCs w:val="40"/>
-                <w:lang w:val="it-IT"/>
-              </w:rPr>
-              <w:t>–</w:t>
-            </w:r>
-            <w:r>
-              <w:rPr>
-                <w:rFonts w:ascii="BRH Malayalam Extra" w:hAnsi="BRH Malayalam Extra" w:cs="BRH Malayalam Extra"/>
-                <w:color w:val="000000"/>
-                <w:sz w:val="32"/>
-                <w:szCs w:val="40"/>
-                <w:lang w:val="it-IT"/>
+              </w:rPr>
+              <w:t>–</w:t>
+            </w:r>
+            <w:r>
+              <w:rPr>
+                <w:rFonts w:ascii="BRH Malayalam Extra" w:hAnsi="BRH Malayalam Extra" w:cs="BRH Malayalam Extra"/>
+                <w:color w:val="000000"/>
+                <w:sz w:val="32"/>
+                <w:szCs w:val="40"/>
               </w:rPr>
               <w:t xml:space="preserve"> Z¦ Z¦ </w:t>
             </w:r>
@@ -7250,7 +7002,6 @@
                 <w:color w:val="000000"/>
                 <w:sz w:val="32"/>
                 <w:szCs w:val="40"/>
-                <w:lang w:val="it-IT"/>
               </w:rPr>
             </w:pPr>
             <w:r>
@@ -7260,7 +7011,6 @@
                 <w:sz w:val="32"/>
                 <w:szCs w:val="40"/>
                 <w:highlight w:val="yellow"/>
-                <w:lang w:val="it-IT"/>
               </w:rPr>
               <w:t>sI</w:t>
             </w:r>
@@ -7270,7 +7020,6 @@
                 <w:color w:val="000000"/>
                 <w:sz w:val="32"/>
                 <w:szCs w:val="40"/>
-                <w:lang w:val="it-IT"/>
               </w:rPr>
               <w:t xml:space="preserve">hp—Ç¦ | </w:t>
             </w:r>
@@ -7287,7 +7036,6 @@
                 <w:color w:val="000000"/>
                 <w:sz w:val="32"/>
                 <w:szCs w:val="40"/>
-                <w:lang w:val="it-IT"/>
               </w:rPr>
             </w:pPr>
             <w:r>
@@ -7295,7 +7043,6 @@
                 <w:rFonts w:cs="BRH Malayalam Extra"/>
                 <w:color w:val="000000"/>
                 <w:szCs w:val="40"/>
-                <w:lang w:val="it-IT"/>
               </w:rPr>
               <w:t>61</w:t>
             </w:r>
@@ -7305,7 +7052,6 @@
                 <w:color w:val="000000"/>
                 <w:sz w:val="32"/>
                 <w:szCs w:val="40"/>
-                <w:lang w:val="it-IT"/>
               </w:rPr>
               <w:t>)</w:t>
             </w:r>
@@ -7315,7 +7061,6 @@
                 <w:color w:val="000000"/>
                 <w:sz w:val="32"/>
                 <w:szCs w:val="40"/>
-                <w:lang w:val="it-IT"/>
               </w:rPr>
               <w:tab/>
             </w:r>
@@ -7324,7 +7069,6 @@
                 <w:rFonts w:cs="BRH Malayalam Extra"/>
                 <w:color w:val="000000"/>
                 <w:szCs w:val="40"/>
-                <w:lang w:val="it-IT"/>
               </w:rPr>
               <w:t>2</w:t>
             </w:r>
@@ -7334,7 +7078,6 @@
                 <w:color w:val="000000"/>
                 <w:sz w:val="32"/>
                 <w:szCs w:val="40"/>
-                <w:lang w:val="it-IT"/>
               </w:rPr>
               <w:t>.</w:t>
             </w:r>
@@ -7343,7 +7086,6 @@
                 <w:rFonts w:cs="BRH Malayalam Extra"/>
                 <w:color w:val="000000"/>
                 <w:szCs w:val="40"/>
-                <w:lang w:val="it-IT"/>
               </w:rPr>
               <w:t>2</w:t>
             </w:r>
@@ -7353,7 +7095,6 @@
                 <w:color w:val="000000"/>
                 <w:sz w:val="32"/>
                 <w:szCs w:val="40"/>
-                <w:lang w:val="it-IT"/>
               </w:rPr>
               <w:t>.</w:t>
             </w:r>
@@ -7362,7 +7103,6 @@
                 <w:rFonts w:cs="BRH Malayalam Extra"/>
                 <w:color w:val="000000"/>
                 <w:szCs w:val="40"/>
-                <w:lang w:val="it-IT"/>
               </w:rPr>
               <w:t>4</w:t>
             </w:r>
@@ -7372,7 +7112,6 @@
                 <w:color w:val="000000"/>
                 <w:sz w:val="32"/>
                 <w:szCs w:val="40"/>
-                <w:lang w:val="it-IT"/>
               </w:rPr>
               <w:t>.</w:t>
             </w:r>
@@ -7381,7 +7120,6 @@
                 <w:rFonts w:cs="BRH Malayalam Extra"/>
                 <w:color w:val="000000"/>
                 <w:szCs w:val="40"/>
-                <w:lang w:val="it-IT"/>
               </w:rPr>
               <w:t>6</w:t>
             </w:r>
@@ -7391,7 +7129,6 @@
                 <w:color w:val="000000"/>
                 <w:sz w:val="32"/>
                 <w:szCs w:val="40"/>
-                <w:lang w:val="it-IT"/>
               </w:rPr>
               <w:t>(</w:t>
             </w:r>
@@ -7400,7 +7137,6 @@
                 <w:rFonts w:cs="BRH Malayalam Extra"/>
                 <w:color w:val="000000"/>
                 <w:szCs w:val="40"/>
-                <w:lang w:val="it-IT"/>
               </w:rPr>
               <w:t>49</w:t>
             </w:r>
@@ -7410,7 +7146,6 @@
                 <w:color w:val="000000"/>
                 <w:sz w:val="32"/>
                 <w:szCs w:val="40"/>
-                <w:lang w:val="it-IT"/>
               </w:rPr>
               <w:t>)-  sI</w:t>
             </w:r>
@@ -7420,17 +7155,15 @@
                 <w:color w:val="000000"/>
                 <w:sz w:val="26"/>
                 <w:szCs w:val="40"/>
-                <w:lang w:val="it-IT"/>
-              </w:rPr>
-              <w:t>–</w:t>
-            </w:r>
-            <w:r>
-              <w:rPr>
-                <w:rFonts w:ascii="BRH Malayalam Extra" w:hAnsi="BRH Malayalam Extra" w:cs="BRH Malayalam Extra"/>
-                <w:color w:val="000000"/>
-                <w:sz w:val="32"/>
-                <w:szCs w:val="40"/>
-                <w:lang w:val="it-IT"/>
+              </w:rPr>
+              <w:t>–</w:t>
+            </w:r>
+            <w:r>
+              <w:rPr>
+                <w:rFonts w:ascii="BRH Malayalam Extra" w:hAnsi="BRH Malayalam Extra" w:cs="BRH Malayalam Extra"/>
+                <w:color w:val="000000"/>
+                <w:sz w:val="32"/>
+                <w:szCs w:val="40"/>
               </w:rPr>
               <w:t>hp—Ç¦ | jR—ixdI |</w:t>
             </w:r>
@@ -7443,11 +7176,9 @@
               <w:adjustRightInd w:val="0"/>
               <w:spacing w:before="0" w:line="240" w:lineRule="auto"/>
               <w:rPr>
-                <w:rFonts w:ascii="BRH Malayalam Extra" w:hAnsi="BRH Malayalam Extra" w:cs="BRH Malayalam Extra"/>
-                <w:color w:val="000000"/>
-                <w:sz w:val="32"/>
-                <w:szCs w:val="40"/>
-                <w:lang w:val="it-IT"/>
+                <w:rFonts w:cs="BRH Malayalam Extra"/>
+                <w:color w:val="000000"/>
+                <w:szCs w:val="40"/>
               </w:rPr>
             </w:pPr>
             <w:r>
@@ -7457,7 +7188,6 @@
                 <w:sz w:val="32"/>
                 <w:szCs w:val="40"/>
                 <w:highlight w:val="yellow"/>
-                <w:lang w:val="it-IT"/>
               </w:rPr>
               <w:t>sI</w:t>
             </w:r>
@@ -7467,7 +7197,6 @@
                 <w:color w:val="000000"/>
                 <w:sz w:val="32"/>
                 <w:szCs w:val="40"/>
-                <w:lang w:val="it-IT"/>
               </w:rPr>
               <w:t>hp—Ç¦</w:t>
             </w:r>
@@ -7477,17 +7206,15 @@
                 <w:color w:val="000000"/>
                 <w:sz w:val="26"/>
                 <w:szCs w:val="40"/>
-                <w:lang w:val="it-IT"/>
-              </w:rPr>
-              <w:t>–</w:t>
-            </w:r>
-            <w:r>
-              <w:rPr>
-                <w:rFonts w:ascii="BRH Malayalam Extra" w:hAnsi="BRH Malayalam Extra" w:cs="BRH Malayalam Extra"/>
-                <w:color w:val="000000"/>
-                <w:sz w:val="32"/>
-                <w:szCs w:val="40"/>
-                <w:lang w:val="it-IT"/>
+              </w:rPr>
+              <w:t>–</w:t>
+            </w:r>
+            <w:r>
+              <w:rPr>
+                <w:rFonts w:ascii="BRH Malayalam Extra" w:hAnsi="BRH Malayalam Extra" w:cs="BRH Malayalam Extra"/>
+                <w:color w:val="000000"/>
+                <w:sz w:val="32"/>
+                <w:szCs w:val="40"/>
               </w:rPr>
               <w:t xml:space="preserve"> jR—ixd</w:t>
             </w:r>
@@ -7497,17 +7224,15 @@
                 <w:color w:val="000000"/>
                 <w:sz w:val="26"/>
                 <w:szCs w:val="40"/>
-                <w:lang w:val="it-IT"/>
-              </w:rPr>
-              <w:t>–</w:t>
-            </w:r>
-            <w:r>
-              <w:rPr>
-                <w:rFonts w:ascii="BRH Malayalam Extra" w:hAnsi="BRH Malayalam Extra" w:cs="BRH Malayalam Extra"/>
-                <w:color w:val="000000"/>
-                <w:sz w:val="32"/>
-                <w:szCs w:val="40"/>
-                <w:lang w:val="it-IT"/>
+              </w:rPr>
+              <w:t>–</w:t>
+            </w:r>
+            <w:r>
+              <w:rPr>
+                <w:rFonts w:ascii="BRH Malayalam Extra" w:hAnsi="BRH Malayalam Extra" w:cs="BRH Malayalam Extra"/>
+                <w:color w:val="000000"/>
+                <w:sz w:val="32"/>
+                <w:szCs w:val="40"/>
               </w:rPr>
               <w:t xml:space="preserve">I </w:t>
             </w:r>
@@ -7516,7 +7241,6 @@
                 <w:rFonts w:ascii="BRH Devanagari Extra" w:hAnsi="BRH Devanagari Extra" w:cs="BRH Malayalam Extra"/>
                 <w:color w:val="000000"/>
                 <w:szCs w:val="40"/>
-                <w:lang w:val="it-IT"/>
               </w:rPr>
               <w:t>Æ</w:t>
             </w:r>
@@ -7526,7 +7250,6 @@
                 <w:color w:val="000000"/>
                 <w:sz w:val="32"/>
                 <w:szCs w:val="40"/>
-                <w:lang w:val="it-IT"/>
               </w:rPr>
               <w:t>jR—ix</w:t>
             </w:r>
@@ -7537,7 +7260,6 @@
                 <w:sz w:val="32"/>
                 <w:szCs w:val="40"/>
                 <w:highlight w:val="yellow"/>
-                <w:lang w:val="it-IT"/>
               </w:rPr>
               <w:t>d</w:t>
             </w:r>
@@ -7548,7 +7270,6 @@
                 <w:sz w:val="26"/>
                 <w:szCs w:val="40"/>
                 <w:highlight w:val="yellow"/>
-                <w:lang w:val="it-IT"/>
               </w:rPr>
               <w:t>–</w:t>
             </w:r>
@@ -7559,7 +7280,6 @@
                 <w:sz w:val="32"/>
                 <w:szCs w:val="40"/>
                 <w:highlight w:val="yellow"/>
-                <w:lang w:val="it-IT"/>
               </w:rPr>
               <w:t>(³§)</w:t>
             </w:r>
@@ -7570,7 +7290,6 @@
                 <w:sz w:val="26"/>
                 <w:szCs w:val="40"/>
                 <w:highlight w:val="yellow"/>
-                <w:lang w:val="it-IT"/>
               </w:rPr>
               <w:t>–</w:t>
             </w:r>
@@ -7581,7 +7300,6 @@
                 <w:sz w:val="32"/>
                 <w:szCs w:val="40"/>
                 <w:highlight w:val="yellow"/>
-                <w:lang w:val="it-IT"/>
               </w:rPr>
               <w:t xml:space="preserve"> sI</w:t>
             </w:r>
@@ -7591,7 +7309,6 @@
                 <w:color w:val="000000"/>
                 <w:sz w:val="32"/>
                 <w:szCs w:val="40"/>
-                <w:lang w:val="it-IT"/>
               </w:rPr>
               <w:t>hp</w:t>
             </w:r>
@@ -7602,7 +7319,6 @@
                 <w:sz w:val="32"/>
                 <w:szCs w:val="40"/>
                 <w:highlight w:val="yellow"/>
-                <w:lang w:val="it-IT"/>
               </w:rPr>
               <w:t>—Ç¦</w:t>
             </w:r>
@@ -7613,7 +7329,6 @@
                 <w:sz w:val="26"/>
                 <w:szCs w:val="40"/>
                 <w:highlight w:val="yellow"/>
-                <w:lang w:val="it-IT"/>
               </w:rPr>
               <w:t>–</w:t>
             </w:r>
@@ -7624,7 +7339,6 @@
                 <w:sz w:val="32"/>
                 <w:szCs w:val="40"/>
                 <w:highlight w:val="yellow"/>
-                <w:lang w:val="it-IT"/>
               </w:rPr>
               <w:t xml:space="preserve"> </w:t>
             </w:r>
@@ -7635,7 +7349,6 @@
                 <w:sz w:val="32"/>
                 <w:szCs w:val="40"/>
                 <w:highlight w:val="yellow"/>
-                <w:lang w:val="it-IT"/>
               </w:rPr>
               <w:lastRenderedPageBreak/>
               <w:t>sI</w:t>
@@ -7646,7 +7359,6 @@
                 <w:color w:val="000000"/>
                 <w:sz w:val="32"/>
                 <w:szCs w:val="40"/>
-                <w:lang w:val="it-IT"/>
               </w:rPr>
               <w:t>hp—Ç¦</w:t>
             </w:r>
@@ -7656,35 +7368,18 @@
                 <w:color w:val="000000"/>
                 <w:sz w:val="26"/>
                 <w:szCs w:val="40"/>
-                <w:lang w:val="it-IT"/>
-              </w:rPr>
-              <w:t>–</w:t>
-            </w:r>
-            <w:r>
-              <w:rPr>
-                <w:rFonts w:ascii="BRH Malayalam Extra" w:hAnsi="BRH Malayalam Extra" w:cs="BRH Malayalam Extra"/>
-                <w:color w:val="000000"/>
-                <w:sz w:val="32"/>
-                <w:szCs w:val="40"/>
-                <w:lang w:val="it-IT"/>
+              </w:rPr>
+              <w:t>–</w:t>
+            </w:r>
+            <w:r>
+              <w:rPr>
+                <w:rFonts w:ascii="BRH Malayalam Extra" w:hAnsi="BRH Malayalam Extra" w:cs="BRH Malayalam Extra"/>
+                <w:color w:val="000000"/>
+                <w:sz w:val="32"/>
+                <w:szCs w:val="40"/>
               </w:rPr>
               <w:t xml:space="preserve"> jR—ixdI | </w:t>
             </w:r>
-          </w:p>
-          <w:p>
-            <w:pPr>
-              <w:widowControl w:val="0"/>
-              <w:autoSpaceDE w:val="0"/>
-              <w:autoSpaceDN w:val="0"/>
-              <w:adjustRightInd w:val="0"/>
-              <w:spacing w:before="0" w:line="240" w:lineRule="auto"/>
-              <w:rPr>
-                <w:rFonts w:cs="BRH Malayalam Extra"/>
-                <w:color w:val="000000"/>
-                <w:szCs w:val="40"/>
-                <w:lang w:val="it-IT"/>
-              </w:rPr>
-            </w:pPr>
           </w:p>
         </w:tc>
         <w:tc>
@@ -7703,7 +7398,6 @@
                 <w:color w:val="000000"/>
                 <w:sz w:val="32"/>
                 <w:szCs w:val="40"/>
-                <w:lang w:val="it-IT"/>
               </w:rPr>
             </w:pPr>
             <w:r>
@@ -7711,7 +7405,6 @@
                 <w:rFonts w:cs="BRH Malayalam Extra"/>
                 <w:color w:val="000000"/>
                 <w:szCs w:val="40"/>
-                <w:lang w:val="it-IT"/>
               </w:rPr>
               <w:lastRenderedPageBreak/>
               <w:t>60</w:t>
@@ -7722,7 +7415,6 @@
                 <w:color w:val="000000"/>
                 <w:sz w:val="32"/>
                 <w:szCs w:val="40"/>
-                <w:lang w:val="it-IT"/>
               </w:rPr>
               <w:t>)</w:t>
             </w:r>
@@ -7732,7 +7424,6 @@
                 <w:color w:val="000000"/>
                 <w:sz w:val="32"/>
                 <w:szCs w:val="40"/>
-                <w:lang w:val="it-IT"/>
               </w:rPr>
               <w:tab/>
             </w:r>
@@ -7741,7 +7432,6 @@
                 <w:rFonts w:cs="BRH Malayalam Extra"/>
                 <w:color w:val="000000"/>
                 <w:szCs w:val="40"/>
-                <w:lang w:val="it-IT"/>
               </w:rPr>
               <w:t>2</w:t>
             </w:r>
@@ -7751,7 +7441,6 @@
                 <w:color w:val="000000"/>
                 <w:sz w:val="32"/>
                 <w:szCs w:val="40"/>
-                <w:lang w:val="it-IT"/>
               </w:rPr>
               <w:t>.</w:t>
             </w:r>
@@ -7760,7 +7449,6 @@
                 <w:rFonts w:cs="BRH Malayalam Extra"/>
                 <w:color w:val="000000"/>
                 <w:szCs w:val="40"/>
-                <w:lang w:val="it-IT"/>
               </w:rPr>
               <w:t>2</w:t>
             </w:r>
@@ -7770,7 +7458,6 @@
                 <w:color w:val="000000"/>
                 <w:sz w:val="32"/>
                 <w:szCs w:val="40"/>
-                <w:lang w:val="it-IT"/>
               </w:rPr>
               <w:t>.</w:t>
             </w:r>
@@ -7779,7 +7466,6 @@
                 <w:rFonts w:cs="BRH Malayalam Extra"/>
                 <w:color w:val="000000"/>
                 <w:szCs w:val="40"/>
-                <w:lang w:val="it-IT"/>
               </w:rPr>
               <w:t>4</w:t>
             </w:r>
@@ -7789,7 +7475,6 @@
                 <w:color w:val="000000"/>
                 <w:sz w:val="32"/>
                 <w:szCs w:val="40"/>
-                <w:lang w:val="it-IT"/>
               </w:rPr>
               <w:t>.</w:t>
             </w:r>
@@ -7798,7 +7483,6 @@
                 <w:rFonts w:cs="BRH Malayalam Extra"/>
                 <w:color w:val="000000"/>
                 <w:szCs w:val="40"/>
-                <w:lang w:val="it-IT"/>
               </w:rPr>
               <w:t>6</w:t>
             </w:r>
@@ -7808,7 +7492,6 @@
                 <w:color w:val="000000"/>
                 <w:sz w:val="32"/>
                 <w:szCs w:val="40"/>
-                <w:lang w:val="it-IT"/>
               </w:rPr>
               <w:t>(</w:t>
             </w:r>
@@ -7817,7 +7500,6 @@
                 <w:rFonts w:cs="BRH Malayalam Extra"/>
                 <w:color w:val="000000"/>
                 <w:szCs w:val="40"/>
-                <w:lang w:val="it-IT"/>
               </w:rPr>
               <w:t>48</w:t>
             </w:r>
@@ -7827,7 +7509,6 @@
                 <w:color w:val="000000"/>
                 <w:sz w:val="32"/>
                 <w:szCs w:val="40"/>
-                <w:lang w:val="it-IT"/>
               </w:rPr>
               <w:t>)-  Z¦ | sI</w:t>
             </w:r>
@@ -7837,17 +7518,15 @@
                 <w:color w:val="000000"/>
                 <w:sz w:val="26"/>
                 <w:szCs w:val="40"/>
-                <w:lang w:val="it-IT"/>
-              </w:rPr>
-              <w:t>–</w:t>
-            </w:r>
-            <w:r>
-              <w:rPr>
-                <w:rFonts w:ascii="BRH Malayalam Extra" w:hAnsi="BRH Malayalam Extra" w:cs="BRH Malayalam Extra"/>
-                <w:color w:val="000000"/>
-                <w:sz w:val="32"/>
-                <w:szCs w:val="40"/>
-                <w:lang w:val="it-IT"/>
+              </w:rPr>
+              <w:t>–</w:t>
+            </w:r>
+            <w:r>
+              <w:rPr>
+                <w:rFonts w:ascii="BRH Malayalam Extra" w:hAnsi="BRH Malayalam Extra" w:cs="BRH Malayalam Extra"/>
+                <w:color w:val="000000"/>
+                <w:sz w:val="32"/>
+                <w:szCs w:val="40"/>
               </w:rPr>
               <w:t xml:space="preserve">hp—Ç¦ | </w:t>
             </w:r>
@@ -7864,7 +7543,6 @@
                 <w:color w:val="000000"/>
                 <w:sz w:val="32"/>
                 <w:szCs w:val="40"/>
-                <w:lang w:val="it-IT"/>
               </w:rPr>
             </w:pPr>
             <w:r>
@@ -7873,7 +7551,6 @@
                 <w:color w:val="000000"/>
                 <w:sz w:val="32"/>
                 <w:szCs w:val="40"/>
-                <w:lang w:val="it-IT"/>
               </w:rPr>
               <w:t xml:space="preserve">Z¦ </w:t>
             </w:r>
@@ -7884,7 +7561,6 @@
                 <w:sz w:val="32"/>
                 <w:szCs w:val="40"/>
                 <w:highlight w:val="green"/>
-                <w:lang w:val="it-IT"/>
               </w:rPr>
               <w:t>s</w:t>
             </w:r>
@@ -7895,17 +7571,15 @@
                 <w:sz w:val="26"/>
                 <w:szCs w:val="40"/>
                 <w:highlight w:val="green"/>
-                <w:lang w:val="it-IT"/>
-              </w:rPr>
-              <w:t>–</w:t>
-            </w:r>
-            <w:r>
-              <w:rPr>
-                <w:rFonts w:ascii="BRH Malayalam Extra" w:hAnsi="BRH Malayalam Extra" w:cs="BRH Malayalam Extra"/>
-                <w:color w:val="000000"/>
-                <w:sz w:val="32"/>
-                <w:szCs w:val="40"/>
-                <w:lang w:val="it-IT"/>
+              </w:rPr>
+              <w:t>–</w:t>
+            </w:r>
+            <w:r>
+              <w:rPr>
+                <w:rFonts w:ascii="BRH Malayalam Extra" w:hAnsi="BRH Malayalam Extra" w:cs="BRH Malayalam Extra"/>
+                <w:color w:val="000000"/>
+                <w:sz w:val="32"/>
+                <w:szCs w:val="40"/>
               </w:rPr>
               <w:t>Ihp—</w:t>
             </w:r>
@@ -7916,7 +7590,6 @@
                 <w:sz w:val="32"/>
                 <w:szCs w:val="40"/>
                 <w:highlight w:val="green"/>
-                <w:lang w:val="it-IT"/>
               </w:rPr>
               <w:t>Ç¦ s</w:t>
             </w:r>
@@ -7927,7 +7600,6 @@
                 <w:sz w:val="26"/>
                 <w:szCs w:val="40"/>
                 <w:highlight w:val="green"/>
-                <w:lang w:val="it-IT"/>
               </w:rPr>
               <w:t>–</w:t>
             </w:r>
@@ -7938,7 +7610,6 @@
                 <w:sz w:val="32"/>
                 <w:szCs w:val="40"/>
                 <w:highlight w:val="green"/>
-                <w:lang w:val="it-IT"/>
               </w:rPr>
               <w:t>I</w:t>
             </w:r>
@@ -7948,7 +7619,6 @@
                 <w:color w:val="000000"/>
                 <w:sz w:val="32"/>
                 <w:szCs w:val="40"/>
-                <w:lang w:val="it-IT"/>
               </w:rPr>
               <w:t>hp—Ç¦</w:t>
             </w:r>
@@ -7958,17 +7628,15 @@
                 <w:color w:val="000000"/>
                 <w:sz w:val="26"/>
                 <w:szCs w:val="40"/>
-                <w:lang w:val="it-IT"/>
-              </w:rPr>
-              <w:t>–</w:t>
-            </w:r>
-            <w:r>
-              <w:rPr>
-                <w:rFonts w:ascii="BRH Malayalam Extra" w:hAnsi="BRH Malayalam Extra" w:cs="BRH Malayalam Extra"/>
-                <w:color w:val="000000"/>
-                <w:sz w:val="32"/>
-                <w:szCs w:val="40"/>
-                <w:lang w:val="it-IT"/>
+              </w:rPr>
+              <w:t>–</w:t>
+            </w:r>
+            <w:r>
+              <w:rPr>
+                <w:rFonts w:ascii="BRH Malayalam Extra" w:hAnsi="BRH Malayalam Extra" w:cs="BRH Malayalam Extra"/>
+                <w:color w:val="000000"/>
+                <w:sz w:val="32"/>
+                <w:szCs w:val="40"/>
               </w:rPr>
               <w:t xml:space="preserve"> Z¦ Z¦ </w:t>
             </w:r>
@@ -7985,7 +7653,6 @@
                 <w:color w:val="000000"/>
                 <w:sz w:val="32"/>
                 <w:szCs w:val="40"/>
-                <w:lang w:val="it-IT"/>
               </w:rPr>
             </w:pPr>
             <w:r>
@@ -7995,7 +7662,6 @@
                 <w:sz w:val="32"/>
                 <w:szCs w:val="40"/>
                 <w:highlight w:val="green"/>
-                <w:lang w:val="it-IT"/>
               </w:rPr>
               <w:t>s</w:t>
             </w:r>
@@ -8006,7 +7672,6 @@
                 <w:sz w:val="26"/>
                 <w:szCs w:val="40"/>
                 <w:highlight w:val="green"/>
-                <w:lang w:val="it-IT"/>
               </w:rPr>
               <w:t>–</w:t>
             </w:r>
@@ -8017,7 +7682,6 @@
                 <w:sz w:val="32"/>
                 <w:szCs w:val="40"/>
                 <w:highlight w:val="green"/>
-                <w:lang w:val="it-IT"/>
               </w:rPr>
               <w:t>I</w:t>
             </w:r>
@@ -8027,7 +7691,6 @@
                 <w:color w:val="000000"/>
                 <w:sz w:val="32"/>
                 <w:szCs w:val="40"/>
-                <w:lang w:val="it-IT"/>
               </w:rPr>
               <w:t xml:space="preserve">hp—Ç¦ | </w:t>
             </w:r>
@@ -8044,7 +7707,6 @@
                 <w:color w:val="000000"/>
                 <w:sz w:val="32"/>
                 <w:szCs w:val="40"/>
-                <w:lang w:val="it-IT"/>
               </w:rPr>
             </w:pPr>
             <w:r>
@@ -8052,7 +7714,6 @@
                 <w:rFonts w:cs="BRH Malayalam Extra"/>
                 <w:color w:val="000000"/>
                 <w:szCs w:val="40"/>
-                <w:lang w:val="it-IT"/>
               </w:rPr>
               <w:t>61</w:t>
             </w:r>
@@ -8062,7 +7723,6 @@
                 <w:color w:val="000000"/>
                 <w:sz w:val="32"/>
                 <w:szCs w:val="40"/>
-                <w:lang w:val="it-IT"/>
               </w:rPr>
               <w:t>)</w:t>
             </w:r>
@@ -8072,7 +7732,6 @@
                 <w:color w:val="000000"/>
                 <w:sz w:val="32"/>
                 <w:szCs w:val="40"/>
-                <w:lang w:val="it-IT"/>
               </w:rPr>
               <w:tab/>
             </w:r>
@@ -8081,7 +7740,6 @@
                 <w:rFonts w:cs="BRH Malayalam Extra"/>
                 <w:color w:val="000000"/>
                 <w:szCs w:val="40"/>
-                <w:lang w:val="it-IT"/>
               </w:rPr>
               <w:t>2</w:t>
             </w:r>
@@ -8091,7 +7749,6 @@
                 <w:color w:val="000000"/>
                 <w:sz w:val="32"/>
                 <w:szCs w:val="40"/>
-                <w:lang w:val="it-IT"/>
               </w:rPr>
               <w:t>.</w:t>
             </w:r>
@@ -8100,7 +7757,6 @@
                 <w:rFonts w:cs="BRH Malayalam Extra"/>
                 <w:color w:val="000000"/>
                 <w:szCs w:val="40"/>
-                <w:lang w:val="it-IT"/>
               </w:rPr>
               <w:t>2</w:t>
             </w:r>
@@ -8110,7 +7766,6 @@
                 <w:color w:val="000000"/>
                 <w:sz w:val="32"/>
                 <w:szCs w:val="40"/>
-                <w:lang w:val="it-IT"/>
               </w:rPr>
               <w:t>.</w:t>
             </w:r>
@@ -8119,7 +7774,6 @@
                 <w:rFonts w:cs="BRH Malayalam Extra"/>
                 <w:color w:val="000000"/>
                 <w:szCs w:val="40"/>
-                <w:lang w:val="it-IT"/>
               </w:rPr>
               <w:t>4</w:t>
             </w:r>
@@ -8129,7 +7783,6 @@
                 <w:color w:val="000000"/>
                 <w:sz w:val="32"/>
                 <w:szCs w:val="40"/>
-                <w:lang w:val="it-IT"/>
               </w:rPr>
               <w:t>.</w:t>
             </w:r>
@@ -8138,7 +7791,6 @@
                 <w:rFonts w:cs="BRH Malayalam Extra"/>
                 <w:color w:val="000000"/>
                 <w:szCs w:val="40"/>
-                <w:lang w:val="it-IT"/>
               </w:rPr>
               <w:t>6</w:t>
             </w:r>
@@ -8148,7 +7800,6 @@
                 <w:color w:val="000000"/>
                 <w:sz w:val="32"/>
                 <w:szCs w:val="40"/>
-                <w:lang w:val="it-IT"/>
               </w:rPr>
               <w:t>(</w:t>
             </w:r>
@@ -8157,7 +7808,6 @@
                 <w:rFonts w:cs="BRH Malayalam Extra"/>
                 <w:color w:val="000000"/>
                 <w:szCs w:val="40"/>
-                <w:lang w:val="it-IT"/>
               </w:rPr>
               <w:t>49</w:t>
             </w:r>
@@ -8167,7 +7817,6 @@
                 <w:color w:val="000000"/>
                 <w:sz w:val="32"/>
                 <w:szCs w:val="40"/>
-                <w:lang w:val="it-IT"/>
               </w:rPr>
               <w:t>)-  sI</w:t>
             </w:r>
@@ -8177,17 +7826,15 @@
                 <w:color w:val="000000"/>
                 <w:sz w:val="26"/>
                 <w:szCs w:val="40"/>
-                <w:lang w:val="it-IT"/>
-              </w:rPr>
-              <w:t>–</w:t>
-            </w:r>
-            <w:r>
-              <w:rPr>
-                <w:rFonts w:ascii="BRH Malayalam Extra" w:hAnsi="BRH Malayalam Extra" w:cs="BRH Malayalam Extra"/>
-                <w:color w:val="000000"/>
-                <w:sz w:val="32"/>
-                <w:szCs w:val="40"/>
-                <w:lang w:val="it-IT"/>
+              </w:rPr>
+              <w:t>–</w:t>
+            </w:r>
+            <w:r>
+              <w:rPr>
+                <w:rFonts w:ascii="BRH Malayalam Extra" w:hAnsi="BRH Malayalam Extra" w:cs="BRH Malayalam Extra"/>
+                <w:color w:val="000000"/>
+                <w:sz w:val="32"/>
+                <w:szCs w:val="40"/>
               </w:rPr>
               <w:t>hp—Ç¦ | jR—ixdI |</w:t>
             </w:r>
@@ -8200,11 +7847,9 @@
               <w:adjustRightInd w:val="0"/>
               <w:spacing w:before="0" w:line="240" w:lineRule="auto"/>
               <w:rPr>
-                <w:rFonts w:ascii="BRH Malayalam Extra" w:hAnsi="BRH Malayalam Extra" w:cs="BRH Malayalam Extra"/>
-                <w:color w:val="000000"/>
-                <w:sz w:val="32"/>
-                <w:szCs w:val="40"/>
-                <w:lang w:val="it-IT"/>
+                <w:rFonts w:cs="BRH Malayalam Extra"/>
+                <w:color w:val="000000"/>
+                <w:szCs w:val="40"/>
               </w:rPr>
             </w:pPr>
             <w:r>
@@ -8214,7 +7859,6 @@
                 <w:sz w:val="32"/>
                 <w:szCs w:val="40"/>
                 <w:highlight w:val="green"/>
-                <w:lang w:val="it-IT"/>
               </w:rPr>
               <w:t>s</w:t>
             </w:r>
@@ -8225,7 +7869,6 @@
                 <w:sz w:val="26"/>
                 <w:szCs w:val="40"/>
                 <w:highlight w:val="green"/>
-                <w:lang w:val="it-IT"/>
               </w:rPr>
               <w:t>–</w:t>
             </w:r>
@@ -8236,7 +7879,6 @@
                 <w:sz w:val="32"/>
                 <w:szCs w:val="40"/>
                 <w:highlight w:val="green"/>
-                <w:lang w:val="it-IT"/>
               </w:rPr>
               <w:t>I</w:t>
             </w:r>
@@ -8246,7 +7888,6 @@
                 <w:color w:val="000000"/>
                 <w:sz w:val="32"/>
                 <w:szCs w:val="40"/>
-                <w:lang w:val="it-IT"/>
               </w:rPr>
               <w:t>hp—Ç¦</w:t>
             </w:r>
@@ -8256,17 +7897,15 @@
                 <w:color w:val="000000"/>
                 <w:sz w:val="26"/>
                 <w:szCs w:val="40"/>
-                <w:lang w:val="it-IT"/>
-              </w:rPr>
-              <w:t>–</w:t>
-            </w:r>
-            <w:r>
-              <w:rPr>
-                <w:rFonts w:ascii="BRH Malayalam Extra" w:hAnsi="BRH Malayalam Extra" w:cs="BRH Malayalam Extra"/>
-                <w:color w:val="000000"/>
-                <w:sz w:val="32"/>
-                <w:szCs w:val="40"/>
-                <w:lang w:val="it-IT"/>
+              </w:rPr>
+              <w:t>–</w:t>
+            </w:r>
+            <w:r>
+              <w:rPr>
+                <w:rFonts w:ascii="BRH Malayalam Extra" w:hAnsi="BRH Malayalam Extra" w:cs="BRH Malayalam Extra"/>
+                <w:color w:val="000000"/>
+                <w:sz w:val="32"/>
+                <w:szCs w:val="40"/>
               </w:rPr>
               <w:t xml:space="preserve"> jR—ixd</w:t>
             </w:r>
@@ -8276,17 +7915,15 @@
                 <w:color w:val="000000"/>
                 <w:sz w:val="26"/>
                 <w:szCs w:val="40"/>
-                <w:lang w:val="it-IT"/>
-              </w:rPr>
-              <w:t>–</w:t>
-            </w:r>
-            <w:r>
-              <w:rPr>
-                <w:rFonts w:ascii="BRH Malayalam Extra" w:hAnsi="BRH Malayalam Extra" w:cs="BRH Malayalam Extra"/>
-                <w:color w:val="000000"/>
-                <w:sz w:val="32"/>
-                <w:szCs w:val="40"/>
-                <w:lang w:val="it-IT"/>
+              </w:rPr>
+              <w:t>–</w:t>
+            </w:r>
+            <w:r>
+              <w:rPr>
+                <w:rFonts w:ascii="BRH Malayalam Extra" w:hAnsi="BRH Malayalam Extra" w:cs="BRH Malayalam Extra"/>
+                <w:color w:val="000000"/>
+                <w:sz w:val="32"/>
+                <w:szCs w:val="40"/>
               </w:rPr>
               <w:t xml:space="preserve">I </w:t>
             </w:r>
@@ -8295,7 +7932,6 @@
                 <w:rFonts w:ascii="BRH Devanagari Extra" w:hAnsi="BRH Devanagari Extra" w:cs="BRH Malayalam Extra"/>
                 <w:color w:val="000000"/>
                 <w:szCs w:val="40"/>
-                <w:lang w:val="it-IT"/>
               </w:rPr>
               <w:t>Æ</w:t>
             </w:r>
@@ -8305,7 +7941,6 @@
                 <w:color w:val="000000"/>
                 <w:sz w:val="32"/>
                 <w:szCs w:val="40"/>
-                <w:lang w:val="it-IT"/>
               </w:rPr>
               <w:t>jR—ix</w:t>
             </w:r>
@@ -8316,7 +7951,6 @@
                 <w:sz w:val="32"/>
                 <w:szCs w:val="40"/>
                 <w:highlight w:val="green"/>
-                <w:lang w:val="it-IT"/>
               </w:rPr>
               <w:t>d(³§) sI</w:t>
             </w:r>
@@ -8327,17 +7961,15 @@
                 <w:sz w:val="26"/>
                 <w:szCs w:val="40"/>
                 <w:highlight w:val="green"/>
-                <w:lang w:val="it-IT"/>
-              </w:rPr>
-              <w:t>–</w:t>
-            </w:r>
-            <w:r>
-              <w:rPr>
-                <w:rFonts w:ascii="BRH Malayalam Extra" w:hAnsi="BRH Malayalam Extra" w:cs="BRH Malayalam Extra"/>
-                <w:color w:val="000000"/>
-                <w:sz w:val="32"/>
-                <w:szCs w:val="40"/>
-                <w:lang w:val="it-IT"/>
+              </w:rPr>
+              <w:t>–</w:t>
+            </w:r>
+            <w:r>
+              <w:rPr>
+                <w:rFonts w:ascii="BRH Malayalam Extra" w:hAnsi="BRH Malayalam Extra" w:cs="BRH Malayalam Extra"/>
+                <w:color w:val="000000"/>
+                <w:sz w:val="32"/>
+                <w:szCs w:val="40"/>
               </w:rPr>
               <w:t>hp</w:t>
             </w:r>
@@ -8348,7 +7980,6 @@
                 <w:sz w:val="32"/>
                 <w:szCs w:val="40"/>
                 <w:highlight w:val="yellow"/>
-                <w:lang w:val="it-IT"/>
               </w:rPr>
               <w:t>—</w:t>
             </w:r>
@@ -8359,7 +7990,6 @@
                 <w:sz w:val="32"/>
                 <w:szCs w:val="40"/>
                 <w:highlight w:val="green"/>
-                <w:lang w:val="it-IT"/>
               </w:rPr>
               <w:t>Ç¦ s</w:t>
             </w:r>
@@ -8370,7 +8000,6 @@
                 <w:sz w:val="26"/>
                 <w:szCs w:val="40"/>
                 <w:highlight w:val="green"/>
-                <w:lang w:val="it-IT"/>
               </w:rPr>
               <w:t>–</w:t>
             </w:r>
@@ -8381,7 +8010,6 @@
                 <w:sz w:val="32"/>
                 <w:szCs w:val="40"/>
                 <w:highlight w:val="green"/>
-                <w:lang w:val="it-IT"/>
               </w:rPr>
               <w:lastRenderedPageBreak/>
               <w:t>I</w:t>
@@ -8392,7 +8020,6 @@
                 <w:color w:val="000000"/>
                 <w:sz w:val="32"/>
                 <w:szCs w:val="40"/>
-                <w:lang w:val="it-IT"/>
               </w:rPr>
               <w:t>hp—Ç¦</w:t>
             </w:r>
@@ -8402,35 +8029,18 @@
                 <w:color w:val="000000"/>
                 <w:sz w:val="26"/>
                 <w:szCs w:val="40"/>
-                <w:lang w:val="it-IT"/>
-              </w:rPr>
-              <w:t>–</w:t>
-            </w:r>
-            <w:r>
-              <w:rPr>
-                <w:rFonts w:ascii="BRH Malayalam Extra" w:hAnsi="BRH Malayalam Extra" w:cs="BRH Malayalam Extra"/>
-                <w:color w:val="000000"/>
-                <w:sz w:val="32"/>
-                <w:szCs w:val="40"/>
-                <w:lang w:val="it-IT"/>
+              </w:rPr>
+              <w:t>–</w:t>
+            </w:r>
+            <w:r>
+              <w:rPr>
+                <w:rFonts w:ascii="BRH Malayalam Extra" w:hAnsi="BRH Malayalam Extra" w:cs="BRH Malayalam Extra"/>
+                <w:color w:val="000000"/>
+                <w:sz w:val="32"/>
+                <w:szCs w:val="40"/>
               </w:rPr>
               <w:t xml:space="preserve"> jR—ixdI | </w:t>
             </w:r>
-          </w:p>
-          <w:p>
-            <w:pPr>
-              <w:widowControl w:val="0"/>
-              <w:autoSpaceDE w:val="0"/>
-              <w:autoSpaceDN w:val="0"/>
-              <w:adjustRightInd w:val="0"/>
-              <w:spacing w:before="0" w:line="240" w:lineRule="auto"/>
-              <w:rPr>
-                <w:rFonts w:cs="BRH Malayalam Extra"/>
-                <w:color w:val="000000"/>
-                <w:szCs w:val="40"/>
-                <w:lang w:val="it-IT"/>
-              </w:rPr>
-            </w:pPr>
           </w:p>
         </w:tc>
       </w:tr>
@@ -8454,7 +8064,6 @@
                 <w:color w:val="000000"/>
                 <w:sz w:val="32"/>
                 <w:szCs w:val="40"/>
-                <w:lang w:val="it-IT"/>
               </w:rPr>
             </w:pPr>
             <w:r>
@@ -8462,7 +8071,6 @@
                 <w:rFonts w:cs="BRH Malayalam Extra"/>
                 <w:color w:val="000000"/>
                 <w:szCs w:val="40"/>
-                <w:lang w:val="it-IT"/>
               </w:rPr>
               <w:lastRenderedPageBreak/>
               <w:t>22</w:t>
@@ -8473,7 +8081,6 @@
                 <w:color w:val="000000"/>
                 <w:sz w:val="32"/>
                 <w:szCs w:val="40"/>
-                <w:lang w:val="it-IT"/>
               </w:rPr>
               <w:t>)</w:t>
             </w:r>
@@ -8483,7 +8090,6 @@
                 <w:color w:val="000000"/>
                 <w:sz w:val="32"/>
                 <w:szCs w:val="40"/>
-                <w:lang w:val="it-IT"/>
               </w:rPr>
               <w:tab/>
             </w:r>
@@ -8492,7 +8098,6 @@
                 <w:rFonts w:cs="BRH Malayalam Extra"/>
                 <w:color w:val="000000"/>
                 <w:szCs w:val="40"/>
-                <w:lang w:val="it-IT"/>
               </w:rPr>
               <w:t>2</w:t>
             </w:r>
@@ -8502,7 +8107,6 @@
                 <w:color w:val="000000"/>
                 <w:sz w:val="32"/>
                 <w:szCs w:val="40"/>
-                <w:lang w:val="it-IT"/>
               </w:rPr>
               <w:t>.</w:t>
             </w:r>
@@ -8511,7 +8115,6 @@
                 <w:rFonts w:cs="BRH Malayalam Extra"/>
                 <w:color w:val="000000"/>
                 <w:szCs w:val="40"/>
-                <w:lang w:val="it-IT"/>
               </w:rPr>
               <w:t>2</w:t>
             </w:r>
@@ -8521,7 +8124,6 @@
                 <w:color w:val="000000"/>
                 <w:sz w:val="32"/>
                 <w:szCs w:val="40"/>
-                <w:lang w:val="it-IT"/>
               </w:rPr>
               <w:t>.</w:t>
             </w:r>
@@ -8530,7 +8132,6 @@
                 <w:rFonts w:cs="BRH Malayalam Extra"/>
                 <w:color w:val="000000"/>
                 <w:szCs w:val="40"/>
-                <w:lang w:val="it-IT"/>
               </w:rPr>
               <w:t>4</w:t>
             </w:r>
@@ -8540,7 +8141,6 @@
                 <w:color w:val="000000"/>
                 <w:sz w:val="32"/>
                 <w:szCs w:val="40"/>
-                <w:lang w:val="it-IT"/>
               </w:rPr>
               <w:t>.</w:t>
             </w:r>
@@ -8549,7 +8149,6 @@
                 <w:rFonts w:cs="BRH Malayalam Extra"/>
                 <w:color w:val="000000"/>
                 <w:szCs w:val="40"/>
-                <w:lang w:val="it-IT"/>
               </w:rPr>
               <w:t>7</w:t>
             </w:r>
@@ -8559,7 +8158,6 @@
                 <w:color w:val="000000"/>
                 <w:sz w:val="32"/>
                 <w:szCs w:val="40"/>
-                <w:lang w:val="it-IT"/>
               </w:rPr>
               <w:t>(</w:t>
             </w:r>
@@ -8568,7 +8166,6 @@
                 <w:rFonts w:cs="BRH Malayalam Extra"/>
                 <w:color w:val="000000"/>
                 <w:szCs w:val="40"/>
-                <w:lang w:val="it-IT"/>
               </w:rPr>
               <w:t>18</w:t>
             </w:r>
@@ -8578,7 +8175,6 @@
                 <w:color w:val="000000"/>
                 <w:sz w:val="32"/>
                 <w:szCs w:val="40"/>
-                <w:lang w:val="it-IT"/>
               </w:rPr>
               <w:t>)-  B | E</w:t>
             </w:r>
@@ -8588,17 +8184,15 @@
                 <w:color w:val="000000"/>
                 <w:sz w:val="26"/>
                 <w:szCs w:val="40"/>
-                <w:lang w:val="it-IT"/>
-              </w:rPr>
-              <w:t>–</w:t>
-            </w:r>
-            <w:r>
-              <w:rPr>
-                <w:rFonts w:ascii="BRH Malayalam Extra" w:hAnsi="BRH Malayalam Extra" w:cs="BRH Malayalam Extra"/>
-                <w:color w:val="000000"/>
-                <w:sz w:val="32"/>
-                <w:szCs w:val="40"/>
-                <w:lang w:val="it-IT"/>
+              </w:rPr>
+              <w:t>–</w:t>
+            </w:r>
+            <w:r>
+              <w:rPr>
+                <w:rFonts w:ascii="BRH Malayalam Extra" w:hAnsi="BRH Malayalam Extra" w:cs="BRH Malayalam Extra"/>
+                <w:color w:val="000000"/>
+                <w:sz w:val="32"/>
+                <w:szCs w:val="40"/>
               </w:rPr>
               <w:t>Pâ</w:t>
             </w:r>
@@ -8608,17 +8202,15 @@
                 <w:color w:val="000000"/>
                 <w:sz w:val="26"/>
                 <w:szCs w:val="40"/>
-                <w:lang w:val="it-IT"/>
-              </w:rPr>
-              <w:t>–</w:t>
-            </w:r>
-            <w:r>
-              <w:rPr>
-                <w:rFonts w:ascii="BRH Malayalam Extra" w:hAnsi="BRH Malayalam Extra" w:cs="BRH Malayalam Extra"/>
-                <w:color w:val="000000"/>
-                <w:sz w:val="32"/>
-                <w:szCs w:val="40"/>
-                <w:lang w:val="it-IT"/>
+              </w:rPr>
+              <w:t>–</w:t>
+            </w:r>
+            <w:r>
+              <w:rPr>
+                <w:rFonts w:ascii="BRH Malayalam Extra" w:hAnsi="BRH Malayalam Extra" w:cs="BRH Malayalam Extra"/>
+                <w:color w:val="000000"/>
+                <w:sz w:val="32"/>
+                <w:szCs w:val="40"/>
               </w:rPr>
               <w:t>Zy</w:t>
             </w:r>
@@ -8628,17 +8220,15 @@
                 <w:color w:val="000000"/>
                 <w:sz w:val="26"/>
                 <w:szCs w:val="40"/>
-                <w:lang w:val="it-IT"/>
-              </w:rPr>
-              <w:t>–</w:t>
-            </w:r>
-            <w:r>
-              <w:rPr>
-                <w:rFonts w:ascii="BRH Malayalam Extra" w:hAnsi="BRH Malayalam Extra" w:cs="BRH Malayalam Extra"/>
-                <w:color w:val="000000"/>
-                <w:sz w:val="32"/>
-                <w:szCs w:val="40"/>
-                <w:lang w:val="it-IT"/>
+              </w:rPr>
+              <w:t>–</w:t>
+            </w:r>
+            <w:r>
+              <w:rPr>
+                <w:rFonts w:ascii="BRH Malayalam Extra" w:hAnsi="BRH Malayalam Extra" w:cs="BRH Malayalam Extra"/>
+                <w:color w:val="000000"/>
+                <w:sz w:val="32"/>
+                <w:szCs w:val="40"/>
               </w:rPr>
               <w:t xml:space="preserve"> |</w:t>
             </w:r>
@@ -8665,7 +8255,6 @@
                 <w:color w:val="000000"/>
                 <w:sz w:val="32"/>
                 <w:szCs w:val="40"/>
-                <w:lang w:val="it-IT"/>
               </w:rPr>
               <w:t>BªPâ— Zõ£</w:t>
             </w:r>
@@ -8676,7 +8265,6 @@
                 <w:sz w:val="32"/>
                 <w:szCs w:val="40"/>
                 <w:highlight w:val="yellow"/>
-                <w:lang w:val="it-IT"/>
               </w:rPr>
               <w:t>Pâ</w:t>
             </w:r>
@@ -8686,7 +8274,6 @@
                 <w:color w:val="000000"/>
                 <w:sz w:val="32"/>
                 <w:szCs w:val="40"/>
-                <w:lang w:val="it-IT"/>
               </w:rPr>
               <w:t xml:space="preserve"> Zõxª</w:t>
             </w:r>
@@ -8697,7 +8284,6 @@
                 <w:sz w:val="32"/>
                 <w:szCs w:val="40"/>
                 <w:highlight w:val="yellow"/>
-                <w:lang w:val="it-IT"/>
               </w:rPr>
               <w:t>P</w:t>
             </w:r>
@@ -8707,7 +8293,6 @@
                 <w:color w:val="000000"/>
                 <w:sz w:val="32"/>
                 <w:szCs w:val="40"/>
-                <w:lang w:val="it-IT"/>
               </w:rPr>
               <w:t xml:space="preserve">âZy | </w:t>
             </w:r>
@@ -9130,19 +8715,8 @@
                 <w:sz w:val="32"/>
                 <w:szCs w:val="40"/>
               </w:rPr>
-              <w:t>)</w:t>
-            </w:r>
-            <w:proofErr w:type="gramStart"/>
-            <w:r>
-              <w:rPr>
-                <w:rFonts w:ascii="BRH Malayalam Extra" w:hAnsi="BRH Malayalam Extra" w:cs="BRH Malayalam Extra"/>
-                <w:color w:val="000000"/>
-                <w:sz w:val="32"/>
-                <w:szCs w:val="40"/>
-              </w:rPr>
-              <w:t>-  C</w:t>
-            </w:r>
-            <w:proofErr w:type="gramEnd"/>
+              <w:t>)-  C</w:t>
+            </w:r>
             <w:r>
               <w:rPr>
                 <w:rFonts w:ascii="BRH Malayalam Extra" w:hAnsi="BRH Malayalam Extra" w:cs="BRH Malayalam Extra"/>
@@ -9378,19 +8952,8 @@
                 <w:sz w:val="32"/>
                 <w:szCs w:val="40"/>
               </w:rPr>
-              <w:t>)</w:t>
-            </w:r>
-            <w:proofErr w:type="gramStart"/>
-            <w:r>
-              <w:rPr>
-                <w:rFonts w:ascii="BRH Malayalam Extra" w:hAnsi="BRH Malayalam Extra" w:cs="BRH Malayalam Extra"/>
-                <w:color w:val="000000"/>
-                <w:sz w:val="32"/>
-                <w:szCs w:val="40"/>
-              </w:rPr>
-              <w:t>-  C</w:t>
-            </w:r>
-            <w:proofErr w:type="gramEnd"/>
+              <w:t>)-  C</w:t>
+            </w:r>
             <w:r>
               <w:rPr>
                 <w:rFonts w:ascii="BRH Malayalam Extra" w:hAnsi="BRH Malayalam Extra" w:cs="BRH Malayalam Extra"/>
@@ -9639,27 +9202,7 @@
                 <w:sz w:val="32"/>
                 <w:szCs w:val="40"/>
               </w:rPr>
-              <w:t>)</w:t>
-            </w:r>
-            <w:proofErr w:type="gramStart"/>
-            <w:r>
-              <w:rPr>
-                <w:rFonts w:ascii="BRH Malayalam Extra" w:hAnsi="BRH Malayalam Extra" w:cs="BRH Malayalam Extra"/>
-                <w:color w:val="000000"/>
-                <w:sz w:val="32"/>
-                <w:szCs w:val="40"/>
-              </w:rPr>
-              <w:t>-  CöÉx</w:t>
-            </w:r>
-            <w:proofErr w:type="gramEnd"/>
-            <w:r>
-              <w:rPr>
-                <w:rFonts w:ascii="BRH Malayalam Extra" w:hAnsi="BRH Malayalam Extra" w:cs="BRH Malayalam Extra"/>
-                <w:color w:val="000000"/>
-                <w:sz w:val="32"/>
-                <w:szCs w:val="40"/>
-              </w:rPr>
-              <w:t>—j | A</w:t>
+              <w:t>)-  CöÉx—j | A</w:t>
             </w:r>
             <w:r>
               <w:rPr>
@@ -9737,19 +9280,36 @@
                 <w:sz w:val="32"/>
                 <w:szCs w:val="40"/>
               </w:rPr>
-              <w:t>CöÉx—jx (³</w:t>
-            </w:r>
-            <w:proofErr w:type="gramStart"/>
-            <w:r>
-              <w:rPr>
-                <w:rFonts w:ascii="BRH Malayalam Extra" w:hAnsi="BRH Malayalam Extra" w:cs="BRH Malayalam Extra"/>
-                <w:color w:val="000000"/>
-                <w:sz w:val="32"/>
-                <w:szCs w:val="40"/>
-              </w:rPr>
-              <w:t>§)¥</w:t>
-            </w:r>
-            <w:proofErr w:type="gramEnd"/>
+              <w:t>CöÉx—jx (³§)¥tx</w:t>
+            </w:r>
+            <w:r>
+              <w:rPr>
+                <w:rFonts w:ascii="BRH Malayalam Extra" w:hAnsi="BRH Malayalam Extra" w:cs="BRH Malayalam Extra"/>
+                <w:color w:val="000000"/>
+                <w:sz w:val="26"/>
+                <w:szCs w:val="40"/>
+              </w:rPr>
+              <w:t>–</w:t>
+            </w:r>
+            <w:r>
+              <w:rPr>
+                <w:rFonts w:ascii="BRH Malayalam Extra" w:hAnsi="BRH Malayalam Extra" w:cs="BRH Malayalam Extra"/>
+                <w:color w:val="000000"/>
+                <w:sz w:val="32"/>
+                <w:szCs w:val="40"/>
+              </w:rPr>
+              <w:t>i</w:t>
+            </w:r>
+            <w:r>
+              <w:rPr>
+                <w:rFonts w:ascii="BRH Malayalam Extra" w:hAnsi="BRH Malayalam Extra" w:cs="BRH Malayalam Extra"/>
+                <w:color w:val="000000"/>
+                <w:sz w:val="32"/>
+                <w:szCs w:val="40"/>
+                <w:highlight w:val="yellow"/>
+              </w:rPr>
+              <w:t>¡¥P— „(³§)¥</w:t>
+            </w:r>
             <w:r>
               <w:rPr>
                 <w:rFonts w:ascii="BRH Malayalam Extra" w:hAnsi="BRH Malayalam Extra" w:cs="BRH Malayalam Extra"/>
@@ -9775,55 +9335,6 @@
                 <w:sz w:val="32"/>
                 <w:szCs w:val="40"/>
               </w:rPr>
-              <w:t>i</w:t>
-            </w:r>
-            <w:r>
-              <w:rPr>
-                <w:rFonts w:ascii="BRH Malayalam Extra" w:hAnsi="BRH Malayalam Extra" w:cs="BRH Malayalam Extra"/>
-                <w:color w:val="000000"/>
-                <w:sz w:val="32"/>
-                <w:szCs w:val="40"/>
-                <w:highlight w:val="yellow"/>
-              </w:rPr>
-              <w:t>¡¥P— „(³</w:t>
-            </w:r>
-            <w:proofErr w:type="gramStart"/>
-            <w:r>
-              <w:rPr>
-                <w:rFonts w:ascii="BRH Malayalam Extra" w:hAnsi="BRH Malayalam Extra" w:cs="BRH Malayalam Extra"/>
-                <w:color w:val="000000"/>
-                <w:sz w:val="32"/>
-                <w:szCs w:val="40"/>
-                <w:highlight w:val="yellow"/>
-              </w:rPr>
-              <w:t>§)¥</w:t>
-            </w:r>
-            <w:proofErr w:type="gramEnd"/>
-            <w:r>
-              <w:rPr>
-                <w:rFonts w:ascii="BRH Malayalam Extra" w:hAnsi="BRH Malayalam Extra" w:cs="BRH Malayalam Extra"/>
-                <w:color w:val="000000"/>
-                <w:sz w:val="32"/>
-                <w:szCs w:val="40"/>
-              </w:rPr>
-              <w:t>tx</w:t>
-            </w:r>
-            <w:r>
-              <w:rPr>
-                <w:rFonts w:ascii="BRH Malayalam Extra" w:hAnsi="BRH Malayalam Extra" w:cs="BRH Malayalam Extra"/>
-                <w:color w:val="000000"/>
-                <w:sz w:val="26"/>
-                <w:szCs w:val="40"/>
-              </w:rPr>
-              <w:t>–</w:t>
-            </w:r>
-            <w:r>
-              <w:rPr>
-                <w:rFonts w:ascii="BRH Malayalam Extra" w:hAnsi="BRH Malayalam Extra" w:cs="BRH Malayalam Extra"/>
-                <w:color w:val="000000"/>
-                <w:sz w:val="32"/>
-                <w:szCs w:val="40"/>
-              </w:rPr>
               <w:t>i¡P</w:t>
             </w:r>
             <w:r>
@@ -9869,27 +9380,7 @@
                 <w:sz w:val="32"/>
                 <w:szCs w:val="40"/>
               </w:rPr>
-              <w:t>—jx (³</w:t>
-            </w:r>
-            <w:proofErr w:type="gramStart"/>
-            <w:r>
-              <w:rPr>
-                <w:rFonts w:ascii="BRH Malayalam Extra" w:hAnsi="BRH Malayalam Extra" w:cs="BRH Malayalam Extra"/>
-                <w:color w:val="000000"/>
-                <w:sz w:val="32"/>
-                <w:szCs w:val="40"/>
-              </w:rPr>
-              <w:t>§)¥</w:t>
-            </w:r>
-            <w:proofErr w:type="gramEnd"/>
-            <w:r>
-              <w:rPr>
-                <w:rFonts w:ascii="BRH Malayalam Extra" w:hAnsi="BRH Malayalam Extra" w:cs="BRH Malayalam Extra"/>
-                <w:color w:val="000000"/>
-                <w:sz w:val="32"/>
-                <w:szCs w:val="40"/>
-              </w:rPr>
-              <w:t>tx</w:t>
+              <w:t>—jx (³§)¥tx</w:t>
             </w:r>
             <w:r>
               <w:rPr>
@@ -10033,19 +9524,8 @@
                 <w:sz w:val="32"/>
                 <w:szCs w:val="40"/>
               </w:rPr>
-              <w:t>)</w:t>
-            </w:r>
-            <w:proofErr w:type="gramStart"/>
-            <w:r>
-              <w:rPr>
-                <w:rFonts w:ascii="BRH Malayalam Extra" w:hAnsi="BRH Malayalam Extra" w:cs="BRH Malayalam Extra"/>
-                <w:color w:val="000000"/>
-                <w:sz w:val="32"/>
-                <w:szCs w:val="40"/>
-              </w:rPr>
-              <w:t>-  A</w:t>
-            </w:r>
-            <w:proofErr w:type="gramEnd"/>
+              <w:t>)-  A</w:t>
+            </w:r>
             <w:r>
               <w:rPr>
                 <w:rFonts w:ascii="BRH Malayalam Extra" w:hAnsi="BRH Malayalam Extra" w:cs="BRH Malayalam Extra"/>
@@ -10247,9 +9727,36 @@
                 <w:sz w:val="32"/>
                 <w:szCs w:val="40"/>
               </w:rPr>
-              <w:t>Wxq— i(³</w:t>
-            </w:r>
-            <w:proofErr w:type="gramStart"/>
+              <w:t>Wxq— i(³§)¥tx</w:t>
+            </w:r>
+            <w:r>
+              <w:rPr>
+                <w:rFonts w:ascii="BRH Malayalam Extra" w:hAnsi="BRH Malayalam Extra" w:cs="BRH Malayalam Extra"/>
+                <w:color w:val="000000"/>
+                <w:sz w:val="26"/>
+                <w:szCs w:val="40"/>
+              </w:rPr>
+              <w:t>–</w:t>
+            </w:r>
+            <w:r>
+              <w:rPr>
+                <w:rFonts w:ascii="BRH Malayalam Extra" w:hAnsi="BRH Malayalam Extra" w:cs="BRH Malayalam Extra"/>
+                <w:color w:val="000000"/>
+                <w:sz w:val="32"/>
+                <w:szCs w:val="40"/>
+              </w:rPr>
+              <w:t>i</w:t>
+            </w:r>
+            <w:r>
+              <w:rPr>
+                <w:rFonts w:ascii="BRH Malayalam Extra" w:hAnsi="BRH Malayalam Extra" w:cs="BRH Malayalam Extra"/>
+                <w:color w:val="000000"/>
+                <w:sz w:val="32"/>
+                <w:szCs w:val="40"/>
+                <w:highlight w:val="yellow"/>
+              </w:rPr>
+              <w:t>¡¥P— „(³</w:t>
+            </w:r>
             <w:r>
               <w:rPr>
                 <w:rFonts w:ascii="BRH Malayalam Extra" w:hAnsi="BRH Malayalam Extra" w:cs="BRH Malayalam Extra"/>
@@ -10259,55 +9766,6 @@
               </w:rPr>
               <w:t>§)¥</w:t>
             </w:r>
-            <w:proofErr w:type="gramEnd"/>
-            <w:r>
-              <w:rPr>
-                <w:rFonts w:ascii="BRH Malayalam Extra" w:hAnsi="BRH Malayalam Extra" w:cs="BRH Malayalam Extra"/>
-                <w:color w:val="000000"/>
-                <w:sz w:val="32"/>
-                <w:szCs w:val="40"/>
-              </w:rPr>
-              <w:t>tx</w:t>
-            </w:r>
-            <w:r>
-              <w:rPr>
-                <w:rFonts w:ascii="BRH Malayalam Extra" w:hAnsi="BRH Malayalam Extra" w:cs="BRH Malayalam Extra"/>
-                <w:color w:val="000000"/>
-                <w:sz w:val="26"/>
-                <w:szCs w:val="40"/>
-              </w:rPr>
-              <w:t>–</w:t>
-            </w:r>
-            <w:r>
-              <w:rPr>
-                <w:rFonts w:ascii="BRH Malayalam Extra" w:hAnsi="BRH Malayalam Extra" w:cs="BRH Malayalam Extra"/>
-                <w:color w:val="000000"/>
-                <w:sz w:val="32"/>
-                <w:szCs w:val="40"/>
-              </w:rPr>
-              <w:t>i</w:t>
-            </w:r>
-            <w:r>
-              <w:rPr>
-                <w:rFonts w:ascii="BRH Malayalam Extra" w:hAnsi="BRH Malayalam Extra" w:cs="BRH Malayalam Extra"/>
-                <w:color w:val="000000"/>
-                <w:sz w:val="32"/>
-                <w:szCs w:val="40"/>
-                <w:highlight w:val="yellow"/>
-              </w:rPr>
-              <w:t>¡¥P— „(³</w:t>
-            </w:r>
-            <w:proofErr w:type="gramStart"/>
-            <w:r>
-              <w:rPr>
-                <w:rFonts w:ascii="BRH Malayalam Extra" w:hAnsi="BRH Malayalam Extra" w:cs="BRH Malayalam Extra"/>
-                <w:color w:val="000000"/>
-                <w:sz w:val="32"/>
-                <w:szCs w:val="40"/>
-              </w:rPr>
-              <w:t>§)¥</w:t>
-            </w:r>
-            <w:proofErr w:type="gramEnd"/>
             <w:r>
               <w:rPr>
                 <w:rFonts w:ascii="BRH Malayalam Extra" w:hAnsi="BRH Malayalam Extra" w:cs="BRH Malayalam Extra"/>
@@ -10482,27 +9940,7 @@
                 <w:sz w:val="32"/>
                 <w:szCs w:val="40"/>
               </w:rPr>
-              <w:t>)</w:t>
-            </w:r>
-            <w:proofErr w:type="gramStart"/>
-            <w:r>
-              <w:rPr>
-                <w:rFonts w:ascii="BRH Malayalam Extra" w:hAnsi="BRH Malayalam Extra" w:cs="BRH Malayalam Extra"/>
-                <w:color w:val="000000"/>
-                <w:sz w:val="32"/>
-                <w:szCs w:val="40"/>
-              </w:rPr>
-              <w:t>-  CöÉx</w:t>
-            </w:r>
-            <w:proofErr w:type="gramEnd"/>
-            <w:r>
-              <w:rPr>
-                <w:rFonts w:ascii="BRH Malayalam Extra" w:hAnsi="BRH Malayalam Extra" w:cs="BRH Malayalam Extra"/>
-                <w:color w:val="000000"/>
-                <w:sz w:val="32"/>
-                <w:szCs w:val="40"/>
-              </w:rPr>
-              <w:t>—j | A</w:t>
+              <w:t>)-  CöÉx—j | A</w:t>
             </w:r>
             <w:r>
               <w:rPr>
@@ -10580,19 +10018,36 @@
                 <w:sz w:val="32"/>
                 <w:szCs w:val="40"/>
               </w:rPr>
-              <w:t>CöÉx—jx (³</w:t>
-            </w:r>
-            <w:proofErr w:type="gramStart"/>
-            <w:r>
-              <w:rPr>
-                <w:rFonts w:ascii="BRH Malayalam Extra" w:hAnsi="BRH Malayalam Extra" w:cs="BRH Malayalam Extra"/>
-                <w:color w:val="000000"/>
-                <w:sz w:val="32"/>
-                <w:szCs w:val="40"/>
-              </w:rPr>
-              <w:t>§)¥</w:t>
-            </w:r>
-            <w:proofErr w:type="gramEnd"/>
+              <w:t>CöÉx—jx (³§)¥tx</w:t>
+            </w:r>
+            <w:r>
+              <w:rPr>
+                <w:rFonts w:ascii="BRH Malayalam Extra" w:hAnsi="BRH Malayalam Extra" w:cs="BRH Malayalam Extra"/>
+                <w:color w:val="000000"/>
+                <w:sz w:val="26"/>
+                <w:szCs w:val="40"/>
+              </w:rPr>
+              <w:t>–</w:t>
+            </w:r>
+            <w:r>
+              <w:rPr>
+                <w:rFonts w:ascii="BRH Malayalam Extra" w:hAnsi="BRH Malayalam Extra" w:cs="BRH Malayalam Extra"/>
+                <w:color w:val="000000"/>
+                <w:sz w:val="32"/>
+                <w:szCs w:val="40"/>
+              </w:rPr>
+              <w:t>i</w:t>
+            </w:r>
+            <w:r>
+              <w:rPr>
+                <w:rFonts w:ascii="BRH Malayalam Extra" w:hAnsi="BRH Malayalam Extra" w:cs="BRH Malayalam Extra"/>
+                <w:color w:val="000000"/>
+                <w:sz w:val="32"/>
+                <w:szCs w:val="40"/>
+                <w:highlight w:val="green"/>
+              </w:rPr>
+              <w:t>¡¥P „(³§)—¥</w:t>
+            </w:r>
             <w:r>
               <w:rPr>
                 <w:rFonts w:ascii="BRH Malayalam Extra" w:hAnsi="BRH Malayalam Extra" w:cs="BRH Malayalam Extra"/>
@@ -10618,43 +10073,6 @@
                 <w:sz w:val="32"/>
                 <w:szCs w:val="40"/>
               </w:rPr>
-              <w:t>i</w:t>
-            </w:r>
-            <w:r>
-              <w:rPr>
-                <w:rFonts w:ascii="BRH Malayalam Extra" w:hAnsi="BRH Malayalam Extra" w:cs="BRH Malayalam Extra"/>
-                <w:color w:val="000000"/>
-                <w:sz w:val="32"/>
-                <w:szCs w:val="40"/>
-                <w:highlight w:val="green"/>
-              </w:rPr>
-              <w:t>¡¥P „(³§)—¥</w:t>
-            </w:r>
-            <w:r>
-              <w:rPr>
-                <w:rFonts w:ascii="BRH Malayalam Extra" w:hAnsi="BRH Malayalam Extra" w:cs="BRH Malayalam Extra"/>
-                <w:color w:val="000000"/>
-                <w:sz w:val="32"/>
-                <w:szCs w:val="40"/>
-              </w:rPr>
-              <w:t>tx</w:t>
-            </w:r>
-            <w:r>
-              <w:rPr>
-                <w:rFonts w:ascii="BRH Malayalam Extra" w:hAnsi="BRH Malayalam Extra" w:cs="BRH Malayalam Extra"/>
-                <w:color w:val="000000"/>
-                <w:sz w:val="26"/>
-                <w:szCs w:val="40"/>
-              </w:rPr>
-              <w:t>–</w:t>
-            </w:r>
-            <w:r>
-              <w:rPr>
-                <w:rFonts w:ascii="BRH Malayalam Extra" w:hAnsi="BRH Malayalam Extra" w:cs="BRH Malayalam Extra"/>
-                <w:color w:val="000000"/>
-                <w:sz w:val="32"/>
-                <w:szCs w:val="40"/>
-              </w:rPr>
               <w:t>i¡P</w:t>
             </w:r>
             <w:r>
@@ -10700,27 +10118,7 @@
                 <w:sz w:val="32"/>
                 <w:szCs w:val="40"/>
               </w:rPr>
-              <w:t>—jx (³</w:t>
-            </w:r>
-            <w:proofErr w:type="gramStart"/>
-            <w:r>
-              <w:rPr>
-                <w:rFonts w:ascii="BRH Malayalam Extra" w:hAnsi="BRH Malayalam Extra" w:cs="BRH Malayalam Extra"/>
-                <w:color w:val="000000"/>
-                <w:sz w:val="32"/>
-                <w:szCs w:val="40"/>
-              </w:rPr>
-              <w:t>§)¥</w:t>
-            </w:r>
-            <w:proofErr w:type="gramEnd"/>
-            <w:r>
-              <w:rPr>
-                <w:rFonts w:ascii="BRH Malayalam Extra" w:hAnsi="BRH Malayalam Extra" w:cs="BRH Malayalam Extra"/>
-                <w:color w:val="000000"/>
-                <w:sz w:val="32"/>
-                <w:szCs w:val="40"/>
-              </w:rPr>
-              <w:t>tx</w:t>
+              <w:t>—jx (³§)¥tx</w:t>
             </w:r>
             <w:r>
               <w:rPr>
@@ -10864,19 +10262,8 @@
                 <w:sz w:val="32"/>
                 <w:szCs w:val="40"/>
               </w:rPr>
-              <w:t>)</w:t>
-            </w:r>
-            <w:proofErr w:type="gramStart"/>
-            <w:r>
-              <w:rPr>
-                <w:rFonts w:ascii="BRH Malayalam Extra" w:hAnsi="BRH Malayalam Extra" w:cs="BRH Malayalam Extra"/>
-                <w:color w:val="000000"/>
-                <w:sz w:val="32"/>
-                <w:szCs w:val="40"/>
-              </w:rPr>
-              <w:t>-  A</w:t>
-            </w:r>
-            <w:proofErr w:type="gramEnd"/>
+              <w:t>)-  A</w:t>
+            </w:r>
             <w:r>
               <w:rPr>
                 <w:rFonts w:ascii="BRH Malayalam Extra" w:hAnsi="BRH Malayalam Extra" w:cs="BRH Malayalam Extra"/>
@@ -11078,27 +10465,7 @@
                 <w:sz w:val="32"/>
                 <w:szCs w:val="40"/>
               </w:rPr>
-              <w:t>Wxq— i(³</w:t>
-            </w:r>
-            <w:proofErr w:type="gramStart"/>
-            <w:r>
-              <w:rPr>
-                <w:rFonts w:ascii="BRH Malayalam Extra" w:hAnsi="BRH Malayalam Extra" w:cs="BRH Malayalam Extra"/>
-                <w:color w:val="000000"/>
-                <w:sz w:val="32"/>
-                <w:szCs w:val="40"/>
-              </w:rPr>
-              <w:t>§)¥</w:t>
-            </w:r>
-            <w:proofErr w:type="gramEnd"/>
-            <w:r>
-              <w:rPr>
-                <w:rFonts w:ascii="BRH Malayalam Extra" w:hAnsi="BRH Malayalam Extra" w:cs="BRH Malayalam Extra"/>
-                <w:color w:val="000000"/>
-                <w:sz w:val="32"/>
-                <w:szCs w:val="40"/>
-              </w:rPr>
-              <w:t>tx</w:t>
+              <w:t>Wxq— i(³§)¥tx</w:t>
             </w:r>
             <w:r>
               <w:rPr>
@@ -11307,19 +10674,8 @@
                 <w:sz w:val="32"/>
                 <w:szCs w:val="40"/>
               </w:rPr>
-              <w:t>)</w:t>
-            </w:r>
-            <w:proofErr w:type="gramStart"/>
-            <w:r>
-              <w:rPr>
-                <w:rFonts w:ascii="BRH Malayalam Extra" w:hAnsi="BRH Malayalam Extra" w:cs="BRH Malayalam Extra"/>
-                <w:color w:val="000000"/>
-                <w:sz w:val="32"/>
-                <w:szCs w:val="40"/>
-              </w:rPr>
-              <w:t>-  G</w:t>
-            </w:r>
-            <w:proofErr w:type="gramEnd"/>
+              <w:t>)-  G</w:t>
+            </w:r>
             <w:r>
               <w:rPr>
                 <w:rFonts w:ascii="BRH Malayalam Extra" w:hAnsi="BRH Malayalam Extra" w:cs="BRH Malayalam Extra"/>
@@ -11500,27 +10856,7 @@
                 <w:sz w:val="32"/>
                 <w:szCs w:val="40"/>
               </w:rPr>
-              <w:t>i¡P— i(³</w:t>
-            </w:r>
-            <w:proofErr w:type="gramStart"/>
-            <w:r>
-              <w:rPr>
-                <w:rFonts w:ascii="BRH Malayalam Extra" w:hAnsi="BRH Malayalam Extra" w:cs="BRH Malayalam Extra"/>
-                <w:color w:val="000000"/>
-                <w:sz w:val="32"/>
-                <w:szCs w:val="40"/>
-              </w:rPr>
-              <w:t>§)¥</w:t>
-            </w:r>
-            <w:proofErr w:type="gramEnd"/>
-            <w:r>
-              <w:rPr>
-                <w:rFonts w:ascii="BRH Malayalam Extra" w:hAnsi="BRH Malayalam Extra" w:cs="BRH Malayalam Extra"/>
-                <w:color w:val="000000"/>
-                <w:sz w:val="32"/>
-                <w:szCs w:val="40"/>
-              </w:rPr>
-              <w:t>tx</w:t>
+              <w:t>i¡P— i(³§)¥tx</w:t>
             </w:r>
             <w:r>
               <w:rPr>
@@ -12734,9 +12070,8 @@
               <w:adjustRightInd w:val="0"/>
               <w:spacing w:before="0" w:line="240" w:lineRule="auto"/>
               <w:rPr>
-                <w:rFonts w:ascii="BRH Malayalam Extra" w:hAnsi="BRH Malayalam Extra" w:cs="BRH Malayalam Extra"/>
-                <w:color w:val="000000"/>
-                <w:sz w:val="32"/>
+                <w:rFonts w:cs="BRH Malayalam Extra"/>
+                <w:color w:val="000000"/>
                 <w:szCs w:val="40"/>
                 <w:lang w:val="it-IT"/>
               </w:rPr>
@@ -12751,21 +12086,6 @@
               </w:rPr>
               <w:t xml:space="preserve">dû£—R¥p | </w:t>
             </w:r>
-          </w:p>
-          <w:p>
-            <w:pPr>
-              <w:widowControl w:val="0"/>
-              <w:autoSpaceDE w:val="0"/>
-              <w:autoSpaceDN w:val="0"/>
-              <w:adjustRightInd w:val="0"/>
-              <w:spacing w:before="0" w:line="240" w:lineRule="auto"/>
-              <w:rPr>
-                <w:rFonts w:cs="BRH Malayalam Extra"/>
-                <w:color w:val="000000"/>
-                <w:szCs w:val="40"/>
-                <w:lang w:val="it-IT"/>
-              </w:rPr>
-            </w:pPr>
           </w:p>
         </w:tc>
       </w:tr>
@@ -12900,19 +12220,8 @@
                 <w:sz w:val="32"/>
                 <w:szCs w:val="40"/>
               </w:rPr>
-              <w:t>)</w:t>
-            </w:r>
-            <w:proofErr w:type="gramStart"/>
-            <w:r>
-              <w:rPr>
-                <w:rFonts w:ascii="BRH Malayalam Extra" w:hAnsi="BRH Malayalam Extra" w:cs="BRH Malayalam Extra"/>
-                <w:color w:val="000000"/>
-                <w:sz w:val="32"/>
-                <w:szCs w:val="40"/>
-              </w:rPr>
-              <w:t>-  A</w:t>
-            </w:r>
-            <w:proofErr w:type="gramEnd"/>
+              <w:t>)-  A</w:t>
+            </w:r>
             <w:r>
               <w:rPr>
                 <w:rFonts w:ascii="BRH Malayalam Extra" w:hAnsi="BRH Malayalam Extra" w:cs="BRH Malayalam Extra"/>
@@ -13045,19 +12354,8 @@
                 <w:sz w:val="32"/>
                 <w:szCs w:val="40"/>
               </w:rPr>
-              <w:t>hõx</w:t>
-            </w:r>
-            <w:proofErr w:type="gramStart"/>
-            <w:r>
-              <w:rPr>
-                <w:rFonts w:ascii="BRH Malayalam Extra" w:hAnsi="BRH Malayalam Extra" w:cs="BRH Malayalam Extra"/>
-                <w:color w:val="000000"/>
-                <w:sz w:val="32"/>
-                <w:szCs w:val="40"/>
-              </w:rPr>
-              <w:t>˜(</w:t>
-            </w:r>
-            <w:proofErr w:type="gramEnd"/>
+              <w:t>hõx˜(</w:t>
+            </w:r>
             <w:r>
               <w:rPr>
                 <w:rFonts w:cs="BRH Malayalam Extra"/>
@@ -13066,7 +12364,6 @@
               </w:rPr>
               <w:t>1</w:t>
             </w:r>
-            <w:proofErr w:type="gramStart"/>
             <w:r>
               <w:rPr>
                 <w:rFonts w:ascii="BRH Malayalam Extra" w:hAnsi="BRH Malayalam Extra" w:cs="BRH Malayalam Extra"/>
@@ -13085,7 +12382,6 @@
               </w:rPr>
               <w:t>)hõ</w:t>
             </w:r>
-            <w:proofErr w:type="gramEnd"/>
             <w:r>
               <w:rPr>
                 <w:rFonts w:ascii="BRH Malayalam Extra" w:hAnsi="BRH Malayalam Extra" w:cs="BRH Malayalam Extra"/>
@@ -13270,19 +12566,8 @@
                 <w:sz w:val="32"/>
                 <w:szCs w:val="40"/>
               </w:rPr>
-              <w:t>)</w:t>
-            </w:r>
-            <w:proofErr w:type="gramStart"/>
-            <w:r>
-              <w:rPr>
-                <w:rFonts w:ascii="BRH Malayalam Extra" w:hAnsi="BRH Malayalam Extra" w:cs="BRH Malayalam Extra"/>
-                <w:color w:val="000000"/>
-                <w:sz w:val="32"/>
-                <w:szCs w:val="40"/>
-              </w:rPr>
-              <w:t>-  A</w:t>
-            </w:r>
-            <w:proofErr w:type="gramEnd"/>
+              <w:t>)-  A</w:t>
+            </w:r>
             <w:r>
               <w:rPr>
                 <w:rFonts w:ascii="BRH Malayalam Extra" w:hAnsi="BRH Malayalam Extra" w:cs="BRH Malayalam Extra"/>
@@ -13415,19 +12700,8 @@
                 <w:sz w:val="32"/>
                 <w:szCs w:val="40"/>
               </w:rPr>
-              <w:t>hõx</w:t>
-            </w:r>
-            <w:proofErr w:type="gramStart"/>
-            <w:r>
-              <w:rPr>
-                <w:rFonts w:ascii="BRH Malayalam Extra" w:hAnsi="BRH Malayalam Extra" w:cs="BRH Malayalam Extra"/>
-                <w:color w:val="000000"/>
-                <w:sz w:val="32"/>
-                <w:szCs w:val="40"/>
-              </w:rPr>
-              <w:t>˜(</w:t>
-            </w:r>
-            <w:proofErr w:type="gramEnd"/>
+              <w:t>hõx˜(</w:t>
+            </w:r>
             <w:r>
               <w:rPr>
                 <w:rFonts w:cs="BRH Malayalam Extra"/>
@@ -13436,34 +12710,23 @@
               </w:rPr>
               <w:t>1</w:t>
             </w:r>
-            <w:proofErr w:type="gramStart"/>
-            <w:r>
-              <w:rPr>
-                <w:rFonts w:ascii="BRH Malayalam Extra" w:hAnsi="BRH Malayalam Extra" w:cs="BRH Malayalam Extra"/>
-                <w:color w:val="000000"/>
-                <w:sz w:val="26"/>
-                <w:szCs w:val="40"/>
-              </w:rPr>
-              <w:t>–</w:t>
-            </w:r>
-            <w:r>
-              <w:rPr>
-                <w:rFonts w:ascii="BRH Malayalam Extra" w:hAnsi="BRH Malayalam Extra" w:cs="BRH Malayalam Extra"/>
-                <w:color w:val="000000"/>
-                <w:sz w:val="32"/>
-                <w:szCs w:val="40"/>
-              </w:rPr>
-              <w:t>)hõ</w:t>
-            </w:r>
-            <w:proofErr w:type="gramEnd"/>
-            <w:r>
-              <w:rPr>
-                <w:rFonts w:ascii="BRH Malayalam Extra" w:hAnsi="BRH Malayalam Extra" w:cs="BRH Malayalam Extra"/>
-                <w:color w:val="000000"/>
-                <w:sz w:val="32"/>
-                <w:szCs w:val="40"/>
-              </w:rPr>
-              <w:t>—</w:t>
+            <w:r>
+              <w:rPr>
+                <w:rFonts w:ascii="BRH Malayalam Extra" w:hAnsi="BRH Malayalam Extra" w:cs="BRH Malayalam Extra"/>
+                <w:color w:val="000000"/>
+                <w:sz w:val="26"/>
+                <w:szCs w:val="40"/>
+              </w:rPr>
+              <w:t>–</w:t>
+            </w:r>
+            <w:r>
+              <w:rPr>
+                <w:rFonts w:ascii="BRH Malayalam Extra" w:hAnsi="BRH Malayalam Extra" w:cs="BRH Malayalam Extra"/>
+                <w:color w:val="000000"/>
+                <w:sz w:val="32"/>
+                <w:szCs w:val="40"/>
+              </w:rPr>
+              <w:t>)hõ—</w:t>
             </w:r>
             <w:r>
               <w:rPr>
@@ -13663,27 +12926,7 @@
                 <w:sz w:val="32"/>
                 <w:szCs w:val="40"/>
               </w:rPr>
-              <w:t>)</w:t>
-            </w:r>
-            <w:proofErr w:type="gramStart"/>
-            <w:r>
-              <w:rPr>
-                <w:rFonts w:ascii="BRH Malayalam Extra" w:hAnsi="BRH Malayalam Extra" w:cs="BRH Malayalam Extra"/>
-                <w:color w:val="000000"/>
-                <w:sz w:val="32"/>
-                <w:szCs w:val="40"/>
-              </w:rPr>
-              <w:t>-  B</w:t>
-            </w:r>
-            <w:proofErr w:type="gramEnd"/>
-            <w:r>
-              <w:rPr>
-                <w:rFonts w:ascii="BRH Malayalam Extra" w:hAnsi="BRH Malayalam Extra" w:cs="BRH Malayalam Extra"/>
-                <w:color w:val="000000"/>
-                <w:sz w:val="32"/>
-                <w:szCs w:val="40"/>
-              </w:rPr>
-              <w:t xml:space="preserve"> | E</w:t>
+              <w:t>)-  B | E</w:t>
             </w:r>
             <w:r>
               <w:rPr>
@@ -13932,27 +13175,7 @@
                 <w:sz w:val="32"/>
                 <w:szCs w:val="40"/>
               </w:rPr>
-              <w:t>)</w:t>
-            </w:r>
-            <w:proofErr w:type="gramStart"/>
-            <w:r>
-              <w:rPr>
-                <w:rFonts w:ascii="BRH Malayalam Extra" w:hAnsi="BRH Malayalam Extra" w:cs="BRH Malayalam Extra"/>
-                <w:color w:val="000000"/>
-                <w:sz w:val="32"/>
-                <w:szCs w:val="40"/>
-              </w:rPr>
-              <w:t>-  B</w:t>
-            </w:r>
-            <w:proofErr w:type="gramEnd"/>
-            <w:r>
-              <w:rPr>
-                <w:rFonts w:ascii="BRH Malayalam Extra" w:hAnsi="BRH Malayalam Extra" w:cs="BRH Malayalam Extra"/>
-                <w:color w:val="000000"/>
-                <w:sz w:val="32"/>
-                <w:szCs w:val="40"/>
-              </w:rPr>
-              <w:t xml:space="preserve"> | E</w:t>
+              <w:t>)-  B | E</w:t>
             </w:r>
             <w:r>
               <w:rPr>
@@ -14230,25 +13453,7 @@
                 <w:sz w:val="32"/>
                 <w:szCs w:val="40"/>
               </w:rPr>
-              <w:t>)</w:t>
-            </w:r>
-            <w:proofErr w:type="gramStart"/>
-            <w:r>
-              <w:rPr>
-                <w:rFonts w:ascii="BRH Malayalam Extra" w:hAnsi="BRH Malayalam Extra" w:cs="BRH Malayalam Extra"/>
-                <w:sz w:val="32"/>
-                <w:szCs w:val="40"/>
-              </w:rPr>
-              <w:t>-  ¥</w:t>
-            </w:r>
-            <w:proofErr w:type="gramEnd"/>
-            <w:r>
-              <w:rPr>
-                <w:rFonts w:ascii="BRH Malayalam Extra" w:hAnsi="BRH Malayalam Extra" w:cs="BRH Malayalam Extra"/>
-                <w:sz w:val="32"/>
-                <w:szCs w:val="40"/>
-              </w:rPr>
-              <w:t>sxi—J | k¡</w:t>
+              <w:t>)-  ¥sxi—J | k¡</w:t>
             </w:r>
             <w:r>
               <w:rPr>
@@ -14503,25 +13708,7 @@
                 <w:sz w:val="32"/>
                 <w:szCs w:val="40"/>
               </w:rPr>
-              <w:t>)</w:t>
-            </w:r>
-            <w:proofErr w:type="gramStart"/>
-            <w:r>
-              <w:rPr>
-                <w:rFonts w:ascii="BRH Malayalam Extra" w:hAnsi="BRH Malayalam Extra" w:cs="BRH Malayalam Extra"/>
-                <w:sz w:val="32"/>
-                <w:szCs w:val="40"/>
-              </w:rPr>
-              <w:t>-  k</w:t>
-            </w:r>
-            <w:proofErr w:type="gramEnd"/>
-            <w:r>
-              <w:rPr>
-                <w:rFonts w:ascii="BRH Malayalam Extra" w:hAnsi="BRH Malayalam Extra" w:cs="BRH Malayalam Extra"/>
-                <w:sz w:val="32"/>
-                <w:szCs w:val="40"/>
-              </w:rPr>
-              <w:t>¡</w:t>
+              <w:t>)-  k¡</w:t>
             </w:r>
             <w:r>
               <w:rPr>
@@ -14772,25 +13959,7 @@
                 <w:sz w:val="32"/>
                 <w:szCs w:val="40"/>
               </w:rPr>
-              <w:t>)</w:t>
-            </w:r>
-            <w:proofErr w:type="gramStart"/>
-            <w:r>
-              <w:rPr>
-                <w:rFonts w:ascii="BRH Malayalam Extra" w:hAnsi="BRH Malayalam Extra" w:cs="BRH Malayalam Extra"/>
-                <w:sz w:val="32"/>
-                <w:szCs w:val="40"/>
-              </w:rPr>
-              <w:t>-  ¥</w:t>
-            </w:r>
-            <w:proofErr w:type="gramEnd"/>
-            <w:r>
-              <w:rPr>
-                <w:rFonts w:ascii="BRH Malayalam Extra" w:hAnsi="BRH Malayalam Extra" w:cs="BRH Malayalam Extra"/>
-                <w:sz w:val="32"/>
-                <w:szCs w:val="40"/>
-              </w:rPr>
-              <w:t>sxi—J | k¡</w:t>
+              <w:t>)-  ¥sxi—J | k¡</w:t>
             </w:r>
             <w:r>
               <w:rPr>
@@ -15037,25 +14206,7 @@
                 <w:sz w:val="32"/>
                 <w:szCs w:val="40"/>
               </w:rPr>
-              <w:t>)</w:t>
-            </w:r>
-            <w:proofErr w:type="gramStart"/>
-            <w:r>
-              <w:rPr>
-                <w:rFonts w:ascii="BRH Malayalam Extra" w:hAnsi="BRH Malayalam Extra" w:cs="BRH Malayalam Extra"/>
-                <w:sz w:val="32"/>
-                <w:szCs w:val="40"/>
-              </w:rPr>
-              <w:t>-  k</w:t>
-            </w:r>
-            <w:proofErr w:type="gramEnd"/>
-            <w:r>
-              <w:rPr>
-                <w:rFonts w:ascii="BRH Malayalam Extra" w:hAnsi="BRH Malayalam Extra" w:cs="BRH Malayalam Extra"/>
-                <w:sz w:val="32"/>
-                <w:szCs w:val="40"/>
-              </w:rPr>
-              <w:t>¡</w:t>
+              <w:t>)-  k¡</w:t>
             </w:r>
             <w:r>
               <w:rPr>
@@ -19561,19 +18712,8 @@
                 <w:sz w:val="32"/>
                 <w:szCs w:val="40"/>
               </w:rPr>
-              <w:t>)</w:t>
-            </w:r>
-            <w:proofErr w:type="gramStart"/>
-            <w:r>
-              <w:rPr>
-                <w:rFonts w:ascii="BRH Malayalam Extra" w:hAnsi="BRH Malayalam Extra" w:cs="BRH Malayalam Extra"/>
-                <w:color w:val="000000"/>
-                <w:sz w:val="32"/>
-                <w:szCs w:val="40"/>
-              </w:rPr>
-              <w:t>-  q</w:t>
-            </w:r>
-            <w:proofErr w:type="gramEnd"/>
+              <w:t>)-  q</w:t>
+            </w:r>
             <w:r>
               <w:rPr>
                 <w:rFonts w:ascii="BRH Malayalam Extra" w:hAnsi="BRH Malayalam Extra" w:cs="BRH Malayalam Extra"/>
@@ -20100,19 +19240,8 @@
                 <w:sz w:val="32"/>
                 <w:szCs w:val="40"/>
               </w:rPr>
-              <w:t>)</w:t>
-            </w:r>
-            <w:proofErr w:type="gramStart"/>
-            <w:r>
-              <w:rPr>
-                <w:rFonts w:ascii="BRH Malayalam Extra" w:hAnsi="BRH Malayalam Extra" w:cs="BRH Malayalam Extra"/>
-                <w:color w:val="000000"/>
-                <w:sz w:val="32"/>
-                <w:szCs w:val="40"/>
-              </w:rPr>
-              <w:t>-  q</w:t>
-            </w:r>
-            <w:proofErr w:type="gramEnd"/>
+              <w:t>)-  q</w:t>
+            </w:r>
             <w:r>
               <w:rPr>
                 <w:rFonts w:ascii="BRH Malayalam Extra" w:hAnsi="BRH Malayalam Extra" w:cs="BRH Malayalam Extra"/>
@@ -20632,76 +19761,6 @@
           <w:sz w:val="32"/>
           <w:szCs w:val="32"/>
           <w:u w:val="single"/>
-          <w:lang w:val="en-IN"/>
-        </w:rPr>
-      </w:pPr>
-    </w:p>
-    <w:p>
-      <w:pPr>
-        <w:spacing w:before="0" w:line="240" w:lineRule="auto"/>
-        <w:jc w:val="center"/>
-        <w:rPr>
-          <w:b/>
-          <w:bCs/>
-          <w:sz w:val="32"/>
-          <w:szCs w:val="32"/>
-          <w:u w:val="single"/>
-          <w:lang w:val="en-IN"/>
-        </w:rPr>
-      </w:pPr>
-    </w:p>
-    <w:p>
-      <w:pPr>
-        <w:spacing w:before="0" w:line="240" w:lineRule="auto"/>
-        <w:jc w:val="center"/>
-        <w:rPr>
-          <w:b/>
-          <w:bCs/>
-          <w:sz w:val="32"/>
-          <w:szCs w:val="32"/>
-          <w:u w:val="single"/>
-          <w:lang w:val="en-IN"/>
-        </w:rPr>
-      </w:pPr>
-    </w:p>
-    <w:p>
-      <w:pPr>
-        <w:spacing w:before="0" w:line="240" w:lineRule="auto"/>
-        <w:jc w:val="center"/>
-        <w:rPr>
-          <w:b/>
-          <w:bCs/>
-          <w:sz w:val="32"/>
-          <w:szCs w:val="32"/>
-          <w:u w:val="single"/>
-          <w:lang w:val="en-IN"/>
-        </w:rPr>
-      </w:pPr>
-    </w:p>
-    <w:p>
-      <w:pPr>
-        <w:spacing w:before="0" w:line="240" w:lineRule="auto"/>
-        <w:jc w:val="center"/>
-        <w:rPr>
-          <w:b/>
-          <w:bCs/>
-          <w:sz w:val="32"/>
-          <w:szCs w:val="32"/>
-          <w:u w:val="single"/>
-          <w:lang w:val="en-IN"/>
-        </w:rPr>
-      </w:pPr>
-    </w:p>
-    <w:p>
-      <w:pPr>
-        <w:spacing w:before="0" w:line="240" w:lineRule="auto"/>
-        <w:jc w:val="center"/>
-        <w:rPr>
-          <w:b/>
-          <w:bCs/>
-          <w:sz w:val="32"/>
-          <w:szCs w:val="32"/>
-          <w:u w:val="single"/>
         </w:rPr>
       </w:pPr>
       <w:r>
@@ -20712,6 +19771,7 @@
           <w:szCs w:val="32"/>
           <w:u w:val="single"/>
         </w:rPr>
+        <w:lastRenderedPageBreak/>
         <w:t xml:space="preserve">TS </w:t>
       </w:r>
       <w:r>

</xml_diff>